<commit_message>
Dorada sekcije Skraćenice - popravak loših preloma
</commit_message>
<xml_diff>
--- a/DiplomskiPredaja.docx
+++ b/DiplomskiPredaja.docx
@@ -28,7 +28,7 @@
       <w:pPr>
         <w:pStyle w:val="Heading1"/>
       </w:pPr>
-      <w:bookmarkStart w:id="0" w:name="_Toc233368180"/>
+      <w:bookmarkStart w:id="0" w:name="_Toc233388930"/>
       <w:r>
         <w:lastRenderedPageBreak/>
         <w:t>Sažetak</w:t>
@@ -214,6 +214,7 @@
         </w:rPr>
       </w:pPr>
       <w:bookmarkStart w:id="1" w:name="_Toc233368181"/>
+      <w:bookmarkStart w:id="2" w:name="_Toc233388931"/>
       <w:r>
         <w:rPr>
           <w:lang w:val="en-US"/>
@@ -222,6 +223,7 @@
         <w:t>Summary</w:t>
       </w:r>
       <w:bookmarkEnd w:id="1"/>
+      <w:bookmarkEnd w:id="2"/>
     </w:p>
     <w:p>
       <w:pPr>
@@ -345,12 +347,14 @@
         <w:pStyle w:val="Heading1"/>
         <w:jc w:val="center"/>
       </w:pPr>
-      <w:bookmarkStart w:id="2" w:name="_Toc233368182"/>
+      <w:bookmarkStart w:id="3" w:name="_Toc233368182"/>
+      <w:bookmarkStart w:id="4" w:name="_Toc233388932"/>
       <w:r>
         <w:lastRenderedPageBreak/>
         <w:t>Sadržaj</w:t>
       </w:r>
-      <w:bookmarkEnd w:id="2"/>
+      <w:bookmarkEnd w:id="3"/>
+      <w:bookmarkEnd w:id="4"/>
     </w:p>
     <w:p>
       <w:pPr>
@@ -393,7 +397,7 @@
         <w:rPr>
           <w:noProof/>
         </w:rPr>
-        <w:instrText xml:space="preserve"> PAGEREF _Toc233368180 \h </w:instrText>
+        <w:instrText xml:space="preserve"> PAGEREF _Toc233388930 \h </w:instrText>
       </w:r>
       <w:r>
         <w:rPr>
@@ -452,7 +456,7 @@
         <w:rPr>
           <w:noProof/>
         </w:rPr>
-        <w:instrText xml:space="preserve"> PAGEREF _Toc233368181 \h </w:instrText>
+        <w:instrText xml:space="preserve"> PAGEREF _Toc233388931 \h </w:instrText>
       </w:r>
       <w:r>
         <w:rPr>
@@ -510,7 +514,7 @@
         <w:rPr>
           <w:noProof/>
         </w:rPr>
-        <w:instrText xml:space="preserve"> PAGEREF _Toc233368182 \h </w:instrText>
+        <w:instrText xml:space="preserve"> PAGEREF _Toc233388932 \h </w:instrText>
       </w:r>
       <w:r>
         <w:rPr>
@@ -568,7 +572,7 @@
         <w:rPr>
           <w:noProof/>
         </w:rPr>
-        <w:instrText xml:space="preserve"> PAGEREF _Toc233368183 \h </w:instrText>
+        <w:instrText xml:space="preserve"> PAGEREF _Toc233388933 \h </w:instrText>
       </w:r>
       <w:r>
         <w:rPr>
@@ -644,7 +648,7 @@
         <w:rPr>
           <w:noProof/>
         </w:rPr>
-        <w:instrText xml:space="preserve"> PAGEREF _Toc233368184 \h </w:instrText>
+        <w:instrText xml:space="preserve"> PAGEREF _Toc233388934 \h </w:instrText>
       </w:r>
       <w:r>
         <w:rPr>
@@ -721,7 +725,7 @@
         <w:rPr>
           <w:noProof/>
         </w:rPr>
-        <w:instrText xml:space="preserve"> PAGEREF _Toc233368185 \h </w:instrText>
+        <w:instrText xml:space="preserve"> PAGEREF _Toc233388935 \h </w:instrText>
       </w:r>
       <w:r>
         <w:rPr>
@@ -798,7 +802,7 @@
         <w:rPr>
           <w:noProof/>
         </w:rPr>
-        <w:instrText xml:space="preserve"> PAGEREF _Toc233368186 \h </w:instrText>
+        <w:instrText xml:space="preserve"> PAGEREF _Toc233388936 \h </w:instrText>
       </w:r>
       <w:r>
         <w:rPr>
@@ -875,7 +879,7 @@
         <w:rPr>
           <w:noProof/>
         </w:rPr>
-        <w:instrText xml:space="preserve"> PAGEREF _Toc233368187 \h </w:instrText>
+        <w:instrText xml:space="preserve"> PAGEREF _Toc233388937 \h </w:instrText>
       </w:r>
       <w:r>
         <w:rPr>
@@ -952,7 +956,7 @@
         <w:rPr>
           <w:noProof/>
         </w:rPr>
-        <w:instrText xml:space="preserve"> PAGEREF _Toc233368188 \h </w:instrText>
+        <w:instrText xml:space="preserve"> PAGEREF _Toc233388938 \h </w:instrText>
       </w:r>
       <w:r>
         <w:rPr>
@@ -1029,7 +1033,7 @@
         <w:rPr>
           <w:noProof/>
         </w:rPr>
-        <w:instrText xml:space="preserve"> PAGEREF _Toc233368189 \h </w:instrText>
+        <w:instrText xml:space="preserve"> PAGEREF _Toc233388939 \h </w:instrText>
       </w:r>
       <w:r>
         <w:rPr>
@@ -1106,7 +1110,7 @@
         <w:rPr>
           <w:noProof/>
         </w:rPr>
-        <w:instrText xml:space="preserve"> PAGEREF _Toc233368190 \h </w:instrText>
+        <w:instrText xml:space="preserve"> PAGEREF _Toc233388940 \h </w:instrText>
       </w:r>
       <w:r>
         <w:rPr>
@@ -1182,7 +1186,7 @@
         <w:rPr>
           <w:noProof/>
         </w:rPr>
-        <w:instrText xml:space="preserve"> PAGEREF _Toc233368191 \h </w:instrText>
+        <w:instrText xml:space="preserve"> PAGEREF _Toc233388941 \h </w:instrText>
       </w:r>
       <w:r>
         <w:rPr>
@@ -1259,7 +1263,7 @@
         <w:rPr>
           <w:noProof/>
         </w:rPr>
-        <w:instrText xml:space="preserve"> PAGEREF _Toc233368192 \h </w:instrText>
+        <w:instrText xml:space="preserve"> PAGEREF _Toc233388942 \h </w:instrText>
       </w:r>
       <w:r>
         <w:rPr>
@@ -1336,7 +1340,7 @@
         <w:rPr>
           <w:noProof/>
         </w:rPr>
-        <w:instrText xml:space="preserve"> PAGEREF _Toc233368193 \h </w:instrText>
+        <w:instrText xml:space="preserve"> PAGEREF _Toc233388943 \h </w:instrText>
       </w:r>
       <w:r>
         <w:rPr>
@@ -1413,7 +1417,7 @@
         <w:rPr>
           <w:noProof/>
         </w:rPr>
-        <w:instrText xml:space="preserve"> PAGEREF _Toc233368194 \h </w:instrText>
+        <w:instrText xml:space="preserve"> PAGEREF _Toc233388944 \h </w:instrText>
       </w:r>
       <w:r>
         <w:rPr>
@@ -1490,7 +1494,7 @@
         <w:rPr>
           <w:noProof/>
         </w:rPr>
-        <w:instrText xml:space="preserve"> PAGEREF _Toc233368195 \h </w:instrText>
+        <w:instrText xml:space="preserve"> PAGEREF _Toc233388945 \h </w:instrText>
       </w:r>
       <w:r>
         <w:rPr>
@@ -1567,7 +1571,7 @@
         <w:rPr>
           <w:noProof/>
         </w:rPr>
-        <w:instrText xml:space="preserve"> PAGEREF _Toc233368196 \h </w:instrText>
+        <w:instrText xml:space="preserve"> PAGEREF _Toc233388946 \h </w:instrText>
       </w:r>
       <w:r>
         <w:rPr>
@@ -1643,7 +1647,7 @@
         <w:rPr>
           <w:noProof/>
         </w:rPr>
-        <w:instrText xml:space="preserve"> PAGEREF _Toc233368197 \h </w:instrText>
+        <w:instrText xml:space="preserve"> PAGEREF _Toc233388947 \h </w:instrText>
       </w:r>
       <w:r>
         <w:rPr>
@@ -1720,7 +1724,7 @@
         <w:rPr>
           <w:noProof/>
         </w:rPr>
-        <w:instrText xml:space="preserve"> PAGEREF _Toc233368198 \h </w:instrText>
+        <w:instrText xml:space="preserve"> PAGEREF _Toc233388948 \h </w:instrText>
       </w:r>
       <w:r>
         <w:rPr>
@@ -1797,7 +1801,7 @@
         <w:rPr>
           <w:noProof/>
         </w:rPr>
-        <w:instrText xml:space="preserve"> PAGEREF _Toc233368199 \h </w:instrText>
+        <w:instrText xml:space="preserve"> PAGEREF _Toc233388949 \h </w:instrText>
       </w:r>
       <w:r>
         <w:rPr>
@@ -1874,7 +1878,7 @@
         <w:rPr>
           <w:noProof/>
         </w:rPr>
-        <w:instrText xml:space="preserve"> PAGEREF _Toc233368200 \h </w:instrText>
+        <w:instrText xml:space="preserve"> PAGEREF _Toc233388950 \h </w:instrText>
       </w:r>
       <w:r>
         <w:rPr>
@@ -1951,7 +1955,7 @@
         <w:rPr>
           <w:noProof/>
         </w:rPr>
-        <w:instrText xml:space="preserve"> PAGEREF _Toc233368201 \h </w:instrText>
+        <w:instrText xml:space="preserve"> PAGEREF _Toc233388951 \h </w:instrText>
       </w:r>
       <w:r>
         <w:rPr>
@@ -2028,7 +2032,7 @@
         <w:rPr>
           <w:noProof/>
         </w:rPr>
-        <w:instrText xml:space="preserve"> PAGEREF _Toc233368202 \h </w:instrText>
+        <w:instrText xml:space="preserve"> PAGEREF _Toc233388952 \h </w:instrText>
       </w:r>
       <w:r>
         <w:rPr>
@@ -2104,7 +2108,7 @@
         <w:rPr>
           <w:noProof/>
         </w:rPr>
-        <w:instrText xml:space="preserve"> PAGEREF _Toc233368203 \h </w:instrText>
+        <w:instrText xml:space="preserve"> PAGEREF _Toc233388953 \h </w:instrText>
       </w:r>
       <w:r>
         <w:rPr>
@@ -2182,7 +2186,7 @@
         <w:rPr>
           <w:noProof/>
         </w:rPr>
-        <w:instrText xml:space="preserve"> PAGEREF _Toc233368204 \h </w:instrText>
+        <w:instrText xml:space="preserve"> PAGEREF _Toc233388954 \h </w:instrText>
       </w:r>
       <w:r>
         <w:rPr>
@@ -2259,7 +2263,7 @@
         <w:rPr>
           <w:noProof/>
         </w:rPr>
-        <w:instrText xml:space="preserve"> PAGEREF _Toc233368205 \h </w:instrText>
+        <w:instrText xml:space="preserve"> PAGEREF _Toc233388955 \h </w:instrText>
       </w:r>
       <w:r>
         <w:rPr>
@@ -2336,7 +2340,7 @@
         <w:rPr>
           <w:noProof/>
         </w:rPr>
-        <w:instrText xml:space="preserve"> PAGEREF _Toc233368206 \h </w:instrText>
+        <w:instrText xml:space="preserve"> PAGEREF _Toc233388956 \h </w:instrText>
       </w:r>
       <w:r>
         <w:rPr>
@@ -2413,7 +2417,7 @@
         <w:rPr>
           <w:noProof/>
         </w:rPr>
-        <w:instrText xml:space="preserve"> PAGEREF _Toc233368207 \h </w:instrText>
+        <w:instrText xml:space="preserve"> PAGEREF _Toc233388957 \h </w:instrText>
       </w:r>
       <w:r>
         <w:rPr>
@@ -2490,7 +2494,7 @@
         <w:rPr>
           <w:noProof/>
         </w:rPr>
-        <w:instrText xml:space="preserve"> PAGEREF _Toc233368208 \h </w:instrText>
+        <w:instrText xml:space="preserve"> PAGEREF _Toc233388958 \h </w:instrText>
       </w:r>
       <w:r>
         <w:rPr>
@@ -2566,7 +2570,7 @@
         <w:rPr>
           <w:noProof/>
         </w:rPr>
-        <w:instrText xml:space="preserve"> PAGEREF _Toc233368209 \h </w:instrText>
+        <w:instrText xml:space="preserve"> PAGEREF _Toc233388959 \h </w:instrText>
       </w:r>
       <w:r>
         <w:rPr>
@@ -2643,7 +2647,7 @@
         <w:rPr>
           <w:noProof/>
         </w:rPr>
-        <w:instrText xml:space="preserve"> PAGEREF _Toc233368210 \h </w:instrText>
+        <w:instrText xml:space="preserve"> PAGEREF _Toc233388960 \h </w:instrText>
       </w:r>
       <w:r>
         <w:rPr>
@@ -2720,7 +2724,7 @@
         <w:rPr>
           <w:noProof/>
         </w:rPr>
-        <w:instrText xml:space="preserve"> PAGEREF _Toc233368211 \h </w:instrText>
+        <w:instrText xml:space="preserve"> PAGEREF _Toc233388961 \h </w:instrText>
       </w:r>
       <w:r>
         <w:rPr>
@@ -2797,7 +2801,7 @@
         <w:rPr>
           <w:noProof/>
         </w:rPr>
-        <w:instrText xml:space="preserve"> PAGEREF _Toc233368212 \h </w:instrText>
+        <w:instrText xml:space="preserve"> PAGEREF _Toc233388962 \h </w:instrText>
       </w:r>
       <w:r>
         <w:rPr>
@@ -2874,7 +2878,7 @@
         <w:rPr>
           <w:noProof/>
         </w:rPr>
-        <w:instrText xml:space="preserve"> PAGEREF _Toc233368213 \h </w:instrText>
+        <w:instrText xml:space="preserve"> PAGEREF _Toc233388963 \h </w:instrText>
       </w:r>
       <w:r>
         <w:rPr>
@@ -2950,7 +2954,7 @@
         <w:rPr>
           <w:noProof/>
         </w:rPr>
-        <w:instrText xml:space="preserve"> PAGEREF _Toc233368214 \h </w:instrText>
+        <w:instrText xml:space="preserve"> PAGEREF _Toc233388964 \h </w:instrText>
       </w:r>
       <w:r>
         <w:rPr>
@@ -3027,7 +3031,7 @@
         <w:rPr>
           <w:noProof/>
         </w:rPr>
-        <w:instrText xml:space="preserve"> PAGEREF _Toc233368215 \h </w:instrText>
+        <w:instrText xml:space="preserve"> PAGEREF _Toc233388965 \h </w:instrText>
       </w:r>
       <w:r>
         <w:rPr>
@@ -3104,7 +3108,7 @@
         <w:rPr>
           <w:noProof/>
         </w:rPr>
-        <w:instrText xml:space="preserve"> PAGEREF _Toc233368216 \h </w:instrText>
+        <w:instrText xml:space="preserve"> PAGEREF _Toc233388966 \h </w:instrText>
       </w:r>
       <w:r>
         <w:rPr>
@@ -3181,7 +3185,7 @@
         <w:rPr>
           <w:noProof/>
         </w:rPr>
-        <w:instrText xml:space="preserve"> PAGEREF _Toc233368217 \h </w:instrText>
+        <w:instrText xml:space="preserve"> PAGEREF _Toc233388967 \h </w:instrText>
       </w:r>
       <w:r>
         <w:rPr>
@@ -3258,7 +3262,7 @@
         <w:rPr>
           <w:noProof/>
         </w:rPr>
-        <w:instrText xml:space="preserve"> PAGEREF _Toc233368218 \h </w:instrText>
+        <w:instrText xml:space="preserve"> PAGEREF _Toc233388968 \h </w:instrText>
       </w:r>
       <w:r>
         <w:rPr>
@@ -3335,7 +3339,7 @@
         <w:rPr>
           <w:noProof/>
         </w:rPr>
-        <w:instrText xml:space="preserve"> PAGEREF _Toc233368219 \h </w:instrText>
+        <w:instrText xml:space="preserve"> PAGEREF _Toc233388969 \h </w:instrText>
       </w:r>
       <w:r>
         <w:rPr>
@@ -3412,7 +3416,7 @@
         <w:rPr>
           <w:noProof/>
         </w:rPr>
-        <w:instrText xml:space="preserve"> PAGEREF _Toc233368220 \h </w:instrText>
+        <w:instrText xml:space="preserve"> PAGEREF _Toc233388970 \h </w:instrText>
       </w:r>
       <w:r>
         <w:rPr>
@@ -3489,7 +3493,7 @@
         <w:rPr>
           <w:noProof/>
         </w:rPr>
-        <w:instrText xml:space="preserve"> PAGEREF _Toc233368221 \h </w:instrText>
+        <w:instrText xml:space="preserve"> PAGEREF _Toc233388971 \h </w:instrText>
       </w:r>
       <w:r>
         <w:rPr>
@@ -3566,7 +3570,7 @@
         <w:rPr>
           <w:noProof/>
         </w:rPr>
-        <w:instrText xml:space="preserve"> PAGEREF _Toc233368222 \h </w:instrText>
+        <w:instrText xml:space="preserve"> PAGEREF _Toc233388972 \h </w:instrText>
       </w:r>
       <w:r>
         <w:rPr>
@@ -3624,7 +3628,7 @@
         <w:rPr>
           <w:noProof/>
         </w:rPr>
-        <w:instrText xml:space="preserve"> PAGEREF _Toc233368223 \h </w:instrText>
+        <w:instrText xml:space="preserve"> PAGEREF _Toc233388973 \h </w:instrText>
       </w:r>
       <w:r>
         <w:rPr>
@@ -3682,7 +3686,7 @@
         <w:rPr>
           <w:noProof/>
         </w:rPr>
-        <w:instrText xml:space="preserve"> PAGEREF _Toc233368224 \h </w:instrText>
+        <w:instrText xml:space="preserve"> PAGEREF _Toc233388974 \h </w:instrText>
       </w:r>
       <w:r>
         <w:rPr>
@@ -3740,7 +3744,7 @@
         <w:rPr>
           <w:noProof/>
         </w:rPr>
-        <w:instrText xml:space="preserve"> PAGEREF _Toc233368225 \h </w:instrText>
+        <w:instrText xml:space="preserve"> PAGEREF _Toc233388975 \h </w:instrText>
       </w:r>
       <w:r>
         <w:rPr>
@@ -3798,7 +3802,7 @@
         <w:rPr>
           <w:noProof/>
         </w:rPr>
-        <w:instrText xml:space="preserve"> PAGEREF _Toc233368226 \h </w:instrText>
+        <w:instrText xml:space="preserve"> PAGEREF _Toc233388976 \h </w:instrText>
       </w:r>
       <w:r>
         <w:rPr>
@@ -3833,12 +3837,14 @@
       <w:pPr>
         <w:pStyle w:val="Heading1"/>
       </w:pPr>
-      <w:bookmarkStart w:id="3" w:name="_Toc233368183"/>
+      <w:bookmarkStart w:id="5" w:name="_Toc233368183"/>
+      <w:bookmarkStart w:id="6" w:name="_Toc233388933"/>
       <w:r>
         <w:lastRenderedPageBreak/>
         <w:t>Uvod</w:t>
       </w:r>
-      <w:bookmarkEnd w:id="3"/>
+      <w:bookmarkEnd w:id="5"/>
+      <w:bookmarkEnd w:id="6"/>
     </w:p>
     <w:p>
       <w:r>
@@ -4231,12 +4237,14 @@
           <w:numId w:val="16"/>
         </w:numPr>
       </w:pPr>
-      <w:bookmarkStart w:id="4" w:name="_Toc233368184"/>
+      <w:bookmarkStart w:id="7" w:name="_Toc233368184"/>
+      <w:bookmarkStart w:id="8" w:name="_Toc233388934"/>
       <w:r>
         <w:lastRenderedPageBreak/>
         <w:t>Teorijska podloga</w:t>
       </w:r>
-      <w:bookmarkEnd w:id="4"/>
+      <w:bookmarkEnd w:id="7"/>
+      <w:bookmarkEnd w:id="8"/>
     </w:p>
     <w:p>
       <w:pPr>
@@ -4246,11 +4254,13 @@
           <w:numId w:val="16"/>
         </w:numPr>
       </w:pPr>
-      <w:bookmarkStart w:id="5" w:name="_Toc233368185"/>
+      <w:bookmarkStart w:id="9" w:name="_Toc233368185"/>
+      <w:bookmarkStart w:id="10" w:name="_Toc233388935"/>
       <w:r>
         <w:t>Internet stvari: pregled</w:t>
       </w:r>
-      <w:bookmarkEnd w:id="5"/>
+      <w:bookmarkEnd w:id="9"/>
+      <w:bookmarkEnd w:id="10"/>
     </w:p>
     <w:p>
       <w:r>
@@ -4519,7 +4529,7 @@
       <w:pPr>
         <w:pStyle w:val="Caption"/>
       </w:pPr>
-      <w:bookmarkStart w:id="6" w:name="_Ref_Sl_1_1"/>
+      <w:bookmarkStart w:id="11" w:name="_Ref_Sl_1_1"/>
       <w:r>
         <w:t xml:space="preserve">Sl. </w:t>
       </w:r>
@@ -4542,7 +4552,7 @@
           <w:t>1</w:t>
         </w:r>
       </w:fldSimple>
-      <w:bookmarkEnd w:id="6"/>
+      <w:bookmarkEnd w:id="11"/>
       <w:r>
         <w:t xml:space="preserve"> Troslojni model </w:t>
       </w:r>
@@ -4563,11 +4573,13 @@
           <w:numId w:val="16"/>
         </w:numPr>
       </w:pPr>
-      <w:bookmarkStart w:id="7" w:name="_Toc233368186"/>
+      <w:bookmarkStart w:id="12" w:name="_Toc233368186"/>
+      <w:bookmarkStart w:id="13" w:name="_Toc233388936"/>
       <w:r>
         <w:t>Protokol MQTT</w:t>
       </w:r>
-      <w:bookmarkEnd w:id="7"/>
+      <w:bookmarkEnd w:id="12"/>
+      <w:bookmarkEnd w:id="13"/>
     </w:p>
     <w:p>
       <w:r>
@@ -4752,7 +4764,7 @@
         </w:rPr>
         <w:lastRenderedPageBreak/>
         <w:drawing>
-          <wp:inline distT="0" distB="0" distL="0" distR="0" wp14:anchorId="622E5C1B" wp14:editId="5CF04070">
+          <wp:inline distT="0" distB="0" distL="0" distR="0" wp14:anchorId="622E5C1B" wp14:editId="514599F8">
             <wp:extent cx="5080000" cy="4710423"/>
             <wp:effectExtent l="0" t="0" r="6350" b="0"/>
             <wp:docPr id="131047165" name="Picture 2"/>
@@ -4798,7 +4810,7 @@
       <w:pPr>
         <w:pStyle w:val="Caption"/>
       </w:pPr>
-      <w:bookmarkStart w:id="8" w:name="_Ref_Sl_1_2"/>
+      <w:bookmarkStart w:id="14" w:name="_Ref_Sl_1_2"/>
       <w:r>
         <w:t xml:space="preserve">Sl. </w:t>
       </w:r>
@@ -4821,7 +4833,7 @@
           <w:t>2</w:t>
         </w:r>
       </w:fldSimple>
-      <w:bookmarkEnd w:id="8"/>
+      <w:bookmarkEnd w:id="14"/>
       <w:r>
         <w:t xml:space="preserve"> Topologija objave i pretplate: ESP32 uređaji, posrednik i mikroservisi.</w:t>
       </w:r>
@@ -5025,7 +5037,7 @@
       <w:pPr>
         <w:pStyle w:val="Caption"/>
       </w:pPr>
-      <w:bookmarkStart w:id="9" w:name="_Ref_Sl_1_3"/>
+      <w:bookmarkStart w:id="15" w:name="_Ref_Sl_1_3"/>
       <w:r>
         <w:t xml:space="preserve">Sl. </w:t>
       </w:r>
@@ -5048,7 +5060,7 @@
           <w:t>3</w:t>
         </w:r>
       </w:fldSimple>
-      <w:bookmarkEnd w:id="9"/>
+      <w:bookmarkEnd w:id="15"/>
       <w:r>
         <w:t xml:space="preserve"> Slijed isporuke poruke pri razini </w:t>
       </w:r>
@@ -5077,11 +5089,13 @@
           <w:numId w:val="16"/>
         </w:numPr>
       </w:pPr>
-      <w:bookmarkStart w:id="10" w:name="_Toc233368187"/>
+      <w:bookmarkStart w:id="16" w:name="_Toc233368187"/>
+      <w:bookmarkStart w:id="17" w:name="_Toc233388937"/>
       <w:r>
         <w:t>Mikroservisna arhitektura i arhitektura vođena događajima</w:t>
       </w:r>
-      <w:bookmarkEnd w:id="10"/>
+      <w:bookmarkEnd w:id="16"/>
+      <w:bookmarkEnd w:id="17"/>
     </w:p>
     <w:p>
       <w:r>
@@ -5177,7 +5191,8 @@
           <w:numId w:val="16"/>
         </w:numPr>
       </w:pPr>
-      <w:bookmarkStart w:id="11" w:name="_Toc233368188"/>
+      <w:bookmarkStart w:id="18" w:name="_Toc233368188"/>
+      <w:bookmarkStart w:id="19" w:name="_Toc233388938"/>
       <w:proofErr w:type="spellStart"/>
       <w:r>
         <w:lastRenderedPageBreak/>
@@ -5195,7 +5210,8 @@
       <w:r>
         <w:t xml:space="preserve"> obrada</w:t>
       </w:r>
-      <w:bookmarkEnd w:id="11"/>
+      <w:bookmarkEnd w:id="18"/>
+      <w:bookmarkEnd w:id="19"/>
     </w:p>
     <w:p>
       <w:r>
@@ -5467,7 +5483,8 @@
           <w:numId w:val="16"/>
         </w:numPr>
       </w:pPr>
-      <w:bookmarkStart w:id="12" w:name="_Toc233368189"/>
+      <w:bookmarkStart w:id="20" w:name="_Toc233368189"/>
+      <w:bookmarkStart w:id="21" w:name="_Toc233388939"/>
       <w:proofErr w:type="spellStart"/>
       <w:r>
         <w:t>Redis</w:t>
@@ -5479,7 +5496,8 @@
       <w:r>
         <w:t>pohrana u radnoj memoriji</w:t>
       </w:r>
-      <w:bookmarkEnd w:id="12"/>
+      <w:bookmarkEnd w:id="20"/>
+      <w:bookmarkEnd w:id="21"/>
     </w:p>
     <w:p>
       <w:proofErr w:type="spellStart"/>
@@ -5645,7 +5663,8 @@
           <w:numId w:val="16"/>
         </w:numPr>
       </w:pPr>
-      <w:bookmarkStart w:id="13" w:name="_Toc233368190"/>
+      <w:bookmarkStart w:id="22" w:name="_Toc233368190"/>
+      <w:bookmarkStart w:id="23" w:name="_Toc233388940"/>
       <w:proofErr w:type="spellStart"/>
       <w:r>
         <w:t>PostgreSQL</w:t>
@@ -5670,7 +5689,8 @@
       <w:r>
         <w:t xml:space="preserve"> podataka</w:t>
       </w:r>
-      <w:bookmarkEnd w:id="13"/>
+      <w:bookmarkEnd w:id="22"/>
+      <w:bookmarkEnd w:id="23"/>
     </w:p>
     <w:p>
       <w:r>
@@ -6010,12 +6030,14 @@
           <w:numId w:val="16"/>
         </w:numPr>
       </w:pPr>
-      <w:bookmarkStart w:id="14" w:name="_Toc233368191"/>
+      <w:bookmarkStart w:id="24" w:name="_Toc233368191"/>
+      <w:bookmarkStart w:id="25" w:name="_Toc233388941"/>
       <w:r>
         <w:lastRenderedPageBreak/>
         <w:t>Arhitektura sustava</w:t>
       </w:r>
-      <w:bookmarkEnd w:id="14"/>
+      <w:bookmarkEnd w:id="24"/>
+      <w:bookmarkEnd w:id="25"/>
     </w:p>
     <w:p>
       <w:pPr>
@@ -6025,11 +6047,13 @@
           <w:numId w:val="16"/>
         </w:numPr>
       </w:pPr>
-      <w:bookmarkStart w:id="15" w:name="_Toc233368192"/>
+      <w:bookmarkStart w:id="26" w:name="_Toc233368192"/>
+      <w:bookmarkStart w:id="27" w:name="_Toc233388942"/>
       <w:r>
         <w:t>Pregled arhitekture</w:t>
       </w:r>
-      <w:bookmarkEnd w:id="15"/>
+      <w:bookmarkEnd w:id="26"/>
+      <w:bookmarkEnd w:id="27"/>
     </w:p>
     <w:p>
       <w:r>
@@ -6298,7 +6322,7 @@
         </w:rPr>
         <w:lastRenderedPageBreak/>
         <w:drawing>
-          <wp:inline distT="0" distB="0" distL="0" distR="0" wp14:anchorId="0985B006" wp14:editId="177ACBFC">
+          <wp:inline distT="0" distB="0" distL="0" distR="0" wp14:anchorId="0985B006" wp14:editId="1F1A5BEF">
             <wp:extent cx="5334000" cy="4240977"/>
             <wp:effectExtent l="0" t="0" r="0" b="7620"/>
             <wp:docPr id="333062197" name="Picture 4"/>
@@ -6344,7 +6368,7 @@
       <w:pPr>
         <w:pStyle w:val="Caption"/>
       </w:pPr>
-      <w:bookmarkStart w:id="16" w:name="_Ref_Sl_2_1"/>
+      <w:bookmarkStart w:id="28" w:name="_Ref_Sl_2_1"/>
       <w:r>
         <w:t xml:space="preserve">Sl. </w:t>
       </w:r>
@@ -6367,7 +6391,7 @@
           <w:t>1</w:t>
         </w:r>
       </w:fldSimple>
-      <w:bookmarkEnd w:id="16"/>
+      <w:bookmarkEnd w:id="28"/>
       <w:r>
         <w:t xml:space="preserve"> Arhitektura sustava na visokoj razini.</w:t>
       </w:r>
@@ -6380,11 +6404,13 @@
           <w:numId w:val="16"/>
         </w:numPr>
       </w:pPr>
-      <w:bookmarkStart w:id="17" w:name="_Toc233368193"/>
+      <w:bookmarkStart w:id="29" w:name="_Toc233368193"/>
+      <w:bookmarkStart w:id="30" w:name="_Toc233388943"/>
       <w:r>
         <w:t>Tijek obrade poruka</w:t>
       </w:r>
-      <w:bookmarkEnd w:id="17"/>
+      <w:bookmarkEnd w:id="29"/>
+      <w:bookmarkEnd w:id="30"/>
     </w:p>
     <w:p>
       <w:r>
@@ -6794,7 +6820,7 @@
       <w:pPr>
         <w:pStyle w:val="Caption"/>
       </w:pPr>
-      <w:bookmarkStart w:id="18" w:name="_Ref_Sl_2_2"/>
+      <w:bookmarkStart w:id="31" w:name="_Ref_Sl_2_2"/>
       <w:r>
         <w:t xml:space="preserve">Sl. </w:t>
       </w:r>
@@ -6817,7 +6843,7 @@
           <w:t>2</w:t>
         </w:r>
       </w:fldSimple>
-      <w:bookmarkEnd w:id="18"/>
+      <w:bookmarkEnd w:id="31"/>
       <w:r>
         <w:t xml:space="preserve"> Slijed životnog ciklusa poruke od uređaja do trajne pohrane i obavijesti.</w:t>
       </w:r>
@@ -6830,11 +6856,13 @@
           <w:numId w:val="16"/>
         </w:numPr>
       </w:pPr>
-      <w:bookmarkStart w:id="19" w:name="_Toc233368194"/>
+      <w:bookmarkStart w:id="32" w:name="_Toc233368194"/>
+      <w:bookmarkStart w:id="33" w:name="_Toc233388944"/>
       <w:r>
         <w:t>Strategija deduplikacije</w:t>
       </w:r>
-      <w:bookmarkEnd w:id="19"/>
+      <w:bookmarkEnd w:id="32"/>
+      <w:bookmarkEnd w:id="33"/>
     </w:p>
     <w:p>
       <w:r>
@@ -7115,7 +7143,7 @@
         </w:rPr>
         <w:lastRenderedPageBreak/>
         <w:drawing>
-          <wp:inline distT="0" distB="0" distL="0" distR="0" wp14:anchorId="262B2A1C" wp14:editId="0D8737F8">
+          <wp:inline distT="0" distB="0" distL="0" distR="0" wp14:anchorId="262B2A1C" wp14:editId="07E2B3DA">
             <wp:extent cx="4074012" cy="7112000"/>
             <wp:effectExtent l="0" t="0" r="3175" b="0"/>
             <wp:docPr id="1518757457" name="Picture 6"/>
@@ -7161,7 +7189,7 @@
       <w:pPr>
         <w:pStyle w:val="Caption"/>
       </w:pPr>
-      <w:bookmarkStart w:id="20" w:name="_Ref_Sl_2_3"/>
+      <w:bookmarkStart w:id="34" w:name="_Ref_Sl_2_3"/>
       <w:r>
         <w:t xml:space="preserve">Sl. </w:t>
       </w:r>
@@ -7184,7 +7212,7 @@
           <w:t>3</w:t>
         </w:r>
       </w:fldSimple>
-      <w:bookmarkEnd w:id="20"/>
+      <w:bookmarkEnd w:id="34"/>
       <w:r>
         <w:t xml:space="preserve"> Tok odluke pri </w:t>
       </w:r>
@@ -7261,11 +7289,13 @@
           <w:numId w:val="16"/>
         </w:numPr>
       </w:pPr>
-      <w:bookmarkStart w:id="21" w:name="_Toc233368195"/>
+      <w:bookmarkStart w:id="35" w:name="_Toc233368195"/>
+      <w:bookmarkStart w:id="36" w:name="_Toc233388945"/>
       <w:r>
         <w:t>Obrasci pouzdanosti</w:t>
       </w:r>
-      <w:bookmarkEnd w:id="21"/>
+      <w:bookmarkEnd w:id="35"/>
+      <w:bookmarkEnd w:id="36"/>
     </w:p>
     <w:p>
       <w:r>
@@ -7637,11 +7667,13 @@
           <w:numId w:val="16"/>
         </w:numPr>
       </w:pPr>
-      <w:bookmarkStart w:id="22" w:name="_Toc233368196"/>
+      <w:bookmarkStart w:id="37" w:name="_Toc233368196"/>
+      <w:bookmarkStart w:id="38" w:name="_Toc233388946"/>
       <w:r>
         <w:t>Infrastrukturna topologija</w:t>
       </w:r>
-      <w:bookmarkEnd w:id="22"/>
+      <w:bookmarkEnd w:id="37"/>
+      <w:bookmarkEnd w:id="38"/>
     </w:p>
     <w:p>
       <w:r>
@@ -7968,7 +8000,7 @@
       <w:pPr>
         <w:pStyle w:val="Caption"/>
       </w:pPr>
-      <w:bookmarkStart w:id="23" w:name="_Ref_Sl_2_4"/>
+      <w:bookmarkStart w:id="39" w:name="_Ref_Sl_2_4"/>
       <w:r>
         <w:t xml:space="preserve">Sl. </w:t>
       </w:r>
@@ -7991,7 +8023,7 @@
           <w:t>4</w:t>
         </w:r>
       </w:fldSimple>
-      <w:bookmarkEnd w:id="23"/>
+      <w:bookmarkEnd w:id="39"/>
       <w:r>
         <w:t xml:space="preserve"> Topologija servisa u okruženju </w:t>
       </w:r>
@@ -8020,12 +8052,14 @@
           <w:numId w:val="16"/>
         </w:numPr>
       </w:pPr>
-      <w:bookmarkStart w:id="24" w:name="_Toc233368197"/>
+      <w:bookmarkStart w:id="40" w:name="_Toc233368197"/>
+      <w:bookmarkStart w:id="41" w:name="_Toc233388947"/>
       <w:r>
         <w:lastRenderedPageBreak/>
         <w:t>Ugrađeni program uređaja ESP32</w:t>
       </w:r>
-      <w:bookmarkEnd w:id="24"/>
+      <w:bookmarkEnd w:id="40"/>
+      <w:bookmarkEnd w:id="41"/>
     </w:p>
     <w:p>
       <w:r>
@@ -8088,14 +8122,16 @@
           <w:numId w:val="16"/>
         </w:numPr>
       </w:pPr>
-      <w:bookmarkStart w:id="25" w:name="_Toc233368198"/>
+      <w:bookmarkStart w:id="42" w:name="_Toc233368198"/>
+      <w:bookmarkStart w:id="43" w:name="_Toc233388948"/>
       <w:r>
         <w:t>Sklopovska</w:t>
       </w:r>
       <w:r>
         <w:t xml:space="preserve"> konfiguracija</w:t>
       </w:r>
-      <w:bookmarkEnd w:id="25"/>
+      <w:bookmarkEnd w:id="42"/>
+      <w:bookmarkEnd w:id="43"/>
     </w:p>
     <w:p>
       <w:r>
@@ -8571,7 +8607,7 @@
       <w:pPr>
         <w:pStyle w:val="Caption"/>
       </w:pPr>
-      <w:bookmarkStart w:id="26" w:name="_Ref_Sl_3_1"/>
+      <w:bookmarkStart w:id="44" w:name="_Ref_Sl_3_1"/>
       <w:r>
         <w:t xml:space="preserve">Sl. </w:t>
       </w:r>
@@ -8594,7 +8630,7 @@
           <w:t>1</w:t>
         </w:r>
       </w:fldSimple>
-      <w:bookmarkEnd w:id="26"/>
+      <w:bookmarkEnd w:id="44"/>
       <w:r>
         <w:t xml:space="preserve"> Spoj razvojne pločice ESP32 i senzora DHT11 s prekidačem.</w:t>
       </w:r>
@@ -9076,7 +9112,7 @@
       <w:pPr>
         <w:pStyle w:val="Caption"/>
       </w:pPr>
-      <w:bookmarkStart w:id="27" w:name="_Ref_Kod_3_1"/>
+      <w:bookmarkStart w:id="45" w:name="_Ref_Kod_3_1"/>
       <w:r>
         <w:t xml:space="preserve">Kôd </w:t>
       </w:r>
@@ -9099,7 +9135,7 @@
           <w:t>1</w:t>
         </w:r>
       </w:fldSimple>
-      <w:bookmarkEnd w:id="27"/>
+      <w:bookmarkEnd w:id="45"/>
       <w:r>
         <w:t xml:space="preserve"> Konfiguracija prevođenja u datoteci </w:t>
       </w:r>
@@ -9236,14 +9272,16 @@
           <w:numId w:val="16"/>
         </w:numPr>
       </w:pPr>
-      <w:bookmarkStart w:id="28" w:name="_Toc233368199"/>
+      <w:bookmarkStart w:id="46" w:name="_Toc233368199"/>
+      <w:bookmarkStart w:id="47" w:name="_Toc233388949"/>
       <w:r>
         <w:t xml:space="preserve">Struktura </w:t>
       </w:r>
       <w:r>
         <w:t>ugrađenog programa</w:t>
       </w:r>
-      <w:bookmarkEnd w:id="28"/>
+      <w:bookmarkEnd w:id="46"/>
+      <w:bookmarkEnd w:id="47"/>
     </w:p>
     <w:p>
       <w:r>
@@ -9835,7 +9873,7 @@
       <w:pPr>
         <w:pStyle w:val="Caption"/>
       </w:pPr>
-      <w:bookmarkStart w:id="29" w:name="_Ref_Kod_3_2"/>
+      <w:bookmarkStart w:id="48" w:name="_Ref_Kod_3_2"/>
       <w:r>
         <w:t xml:space="preserve">Kôd </w:t>
       </w:r>
@@ -9858,7 +9896,7 @@
           <w:t>2</w:t>
         </w:r>
       </w:fldSimple>
-      <w:bookmarkEnd w:id="29"/>
+      <w:bookmarkEnd w:id="48"/>
       <w:r>
         <w:t xml:space="preserve"> Konfiguracijske konstante uređaja (</w:t>
       </w:r>
@@ -9989,11 +10027,13 @@
           <w:numId w:val="16"/>
         </w:numPr>
       </w:pPr>
-      <w:bookmarkStart w:id="30" w:name="_Toc233368200"/>
+      <w:bookmarkStart w:id="49" w:name="_Toc233368200"/>
+      <w:bookmarkStart w:id="50" w:name="_Toc233388950"/>
       <w:r>
         <w:t>NTP sinkronizacija i identifikatori poruka</w:t>
       </w:r>
-      <w:bookmarkEnd w:id="30"/>
+      <w:bookmarkEnd w:id="49"/>
+      <w:bookmarkEnd w:id="50"/>
     </w:p>
     <w:p>
       <w:r>
@@ -10637,7 +10677,7 @@
       <w:pPr>
         <w:pStyle w:val="Caption"/>
       </w:pPr>
-      <w:bookmarkStart w:id="31" w:name="_Ref_Kod_3_3"/>
+      <w:bookmarkStart w:id="51" w:name="_Ref_Kod_3_3"/>
       <w:r>
         <w:t xml:space="preserve">Kôd </w:t>
       </w:r>
@@ -10660,7 +10700,7 @@
           <w:t>3</w:t>
         </w:r>
       </w:fldSimple>
-      <w:bookmarkEnd w:id="31"/>
+      <w:bookmarkEnd w:id="51"/>
       <w:r>
         <w:t xml:space="preserve"> Sinkronizacija vremena putem NTP-a.</w:t>
       </w:r>
@@ -11107,7 +11147,7 @@
       <w:pPr>
         <w:pStyle w:val="Caption"/>
       </w:pPr>
-      <w:bookmarkStart w:id="32" w:name="_Ref_Kod_3_4"/>
+      <w:bookmarkStart w:id="52" w:name="_Ref_Kod_3_4"/>
       <w:r>
         <w:t xml:space="preserve">Kôd </w:t>
       </w:r>
@@ -11130,7 +11170,7 @@
           <w:t>4</w:t>
         </w:r>
       </w:fldSimple>
-      <w:bookmarkEnd w:id="32"/>
+      <w:bookmarkEnd w:id="52"/>
       <w:r>
         <w:t xml:space="preserve"> Generiranje jedinstvenog identifikatora poruke.</w:t>
       </w:r>
@@ -11143,11 +11183,13 @@
           <w:numId w:val="16"/>
         </w:numPr>
       </w:pPr>
-      <w:bookmarkStart w:id="33" w:name="_Toc233368201"/>
+      <w:bookmarkStart w:id="53" w:name="_Toc233368201"/>
+      <w:bookmarkStart w:id="54" w:name="_Toc233388951"/>
       <w:r>
         <w:t>Objava telemetrije</w:t>
       </w:r>
-      <w:bookmarkEnd w:id="33"/>
+      <w:bookmarkEnd w:id="53"/>
+      <w:bookmarkEnd w:id="54"/>
     </w:p>
     <w:p>
       <w:r>
@@ -11816,7 +11858,7 @@
       <w:pPr>
         <w:pStyle w:val="Caption"/>
       </w:pPr>
-      <w:bookmarkStart w:id="34" w:name="_Ref_Kod_3_5"/>
+      <w:bookmarkStart w:id="55" w:name="_Ref_Kod_3_5"/>
       <w:r>
         <w:t xml:space="preserve">Kôd </w:t>
       </w:r>
@@ -11839,7 +11881,7 @@
           <w:t>5</w:t>
         </w:r>
       </w:fldSimple>
-      <w:bookmarkEnd w:id="34"/>
+      <w:bookmarkEnd w:id="55"/>
       <w:r>
         <w:t xml:space="preserve"> Očitavanje senzora i objava telemetrije.</w:t>
       </w:r>
@@ -13353,7 +13395,7 @@
       <w:pPr>
         <w:pStyle w:val="Caption"/>
       </w:pPr>
-      <w:bookmarkStart w:id="35" w:name="_Ref_Kod_3_6"/>
+      <w:bookmarkStart w:id="56" w:name="_Ref_Kod_3_6"/>
       <w:r>
         <w:t xml:space="preserve">Kôd </w:t>
       </w:r>
@@ -13376,7 +13418,7 @@
           <w:t>6</w:t>
         </w:r>
       </w:fldSimple>
-      <w:bookmarkEnd w:id="35"/>
+      <w:bookmarkEnd w:id="56"/>
       <w:r>
         <w:t xml:space="preserve"> Sastavljanje korisnog tereta i objava očitanja.</w:t>
       </w:r>
@@ -13389,7 +13431,8 @@
           <w:numId w:val="16"/>
         </w:numPr>
       </w:pPr>
-      <w:bookmarkStart w:id="36" w:name="_Toc233368202"/>
+      <w:bookmarkStart w:id="57" w:name="_Toc233368202"/>
+      <w:bookmarkStart w:id="58" w:name="_Toc233388952"/>
       <w:r>
         <w:t xml:space="preserve">Logika ponovnog spajanja i </w:t>
       </w:r>
@@ -13397,7 +13440,8 @@
       <w:r>
         <w:t>međuspremnik</w:t>
       </w:r>
-      <w:bookmarkEnd w:id="36"/>
+      <w:bookmarkEnd w:id="57"/>
+      <w:bookmarkEnd w:id="58"/>
       <w:proofErr w:type="spellEnd"/>
     </w:p>
     <w:p>
@@ -14617,7 +14661,7 @@
       <w:pPr>
         <w:pStyle w:val="Caption"/>
       </w:pPr>
-      <w:bookmarkStart w:id="37" w:name="_Ref_Kod_3_7"/>
+      <w:bookmarkStart w:id="59" w:name="_Ref_Kod_3_7"/>
       <w:r>
         <w:t xml:space="preserve">Kôd </w:t>
       </w:r>
@@ -14640,7 +14684,7 @@
           <w:t>7</w:t>
         </w:r>
       </w:fldSimple>
-      <w:bookmarkEnd w:id="37"/>
+      <w:bookmarkEnd w:id="59"/>
       <w:r>
         <w:t xml:space="preserve"> </w:t>
       </w:r>
@@ -16076,7 +16120,7 @@
       <w:pPr>
         <w:pStyle w:val="Caption"/>
       </w:pPr>
-      <w:bookmarkStart w:id="38" w:name="_Ref_Kod_3_8"/>
+      <w:bookmarkStart w:id="60" w:name="_Ref_Kod_3_8"/>
       <w:r>
         <w:t xml:space="preserve">Kôd </w:t>
       </w:r>
@@ -16099,7 +16143,7 @@
           <w:t>8</w:t>
         </w:r>
       </w:fldSimple>
-      <w:bookmarkEnd w:id="38"/>
+      <w:bookmarkEnd w:id="60"/>
       <w:r>
         <w:t xml:space="preserve"> Kružni </w:t>
       </w:r>
@@ -16190,12 +16234,14 @@
           <w:numId w:val="16"/>
         </w:numPr>
       </w:pPr>
-      <w:bookmarkStart w:id="39" w:name="_Toc233368203"/>
+      <w:bookmarkStart w:id="61" w:name="_Toc233368203"/>
+      <w:bookmarkStart w:id="62" w:name="_Toc233388953"/>
       <w:r>
         <w:lastRenderedPageBreak/>
         <w:t>Implementacija mikroservisa</w:t>
       </w:r>
-      <w:bookmarkEnd w:id="39"/>
+      <w:bookmarkEnd w:id="61"/>
+      <w:bookmarkEnd w:id="62"/>
     </w:p>
     <w:p>
       <w:r>
@@ -16226,7 +16272,8 @@
           <w:numId w:val="16"/>
         </w:numPr>
       </w:pPr>
-      <w:bookmarkStart w:id="40" w:name="_Toc233368204"/>
+      <w:bookmarkStart w:id="63" w:name="_Toc233368204"/>
+      <w:bookmarkStart w:id="64" w:name="_Toc233388954"/>
       <w:r>
         <w:t xml:space="preserve">Pregled </w:t>
       </w:r>
@@ -16246,7 +16293,8 @@
       <w:r>
         <w:t xml:space="preserve"> projekata</w:t>
       </w:r>
-      <w:bookmarkEnd w:id="40"/>
+      <w:bookmarkEnd w:id="63"/>
+      <w:bookmarkEnd w:id="64"/>
     </w:p>
     <w:p>
       <w:r>
@@ -17086,7 +17134,7 @@
       <w:pPr>
         <w:pStyle w:val="Caption"/>
       </w:pPr>
-      <w:bookmarkStart w:id="41" w:name="_Ref_Kod_4_1"/>
+      <w:bookmarkStart w:id="65" w:name="_Ref_Kod_4_1"/>
       <w:r>
         <w:t xml:space="preserve">Kôd </w:t>
       </w:r>
@@ -17109,7 +17157,7 @@
           <w:t>1</w:t>
         </w:r>
       </w:fldSimple>
-      <w:bookmarkEnd w:id="41"/>
+      <w:bookmarkEnd w:id="65"/>
       <w:r>
         <w:t xml:space="preserve"> Izvadak konfiguracije servisa za unos (</w:t>
       </w:r>
@@ -17222,11 +17270,13 @@
           <w:numId w:val="16"/>
         </w:numPr>
       </w:pPr>
-      <w:bookmarkStart w:id="42" w:name="_Toc233368205"/>
+      <w:bookmarkStart w:id="66" w:name="_Toc233368205"/>
+      <w:bookmarkStart w:id="67" w:name="_Toc233388955"/>
       <w:r>
         <w:t>MQTT konfiguracija i konekcija</w:t>
       </w:r>
-      <w:bookmarkEnd w:id="42"/>
+      <w:bookmarkEnd w:id="66"/>
+      <w:bookmarkEnd w:id="67"/>
     </w:p>
     <w:p>
       <w:r>
@@ -19313,7 +19363,7 @@
       <w:pPr>
         <w:pStyle w:val="Caption"/>
       </w:pPr>
-      <w:bookmarkStart w:id="43" w:name="_Ref_Kod_4_2"/>
+      <w:bookmarkStart w:id="68" w:name="_Ref_Kod_4_2"/>
       <w:r>
         <w:t xml:space="preserve">Kôd </w:t>
       </w:r>
@@ -19336,7 +19386,7 @@
           <w:t>2</w:t>
         </w:r>
       </w:fldSimple>
-      <w:bookmarkEnd w:id="43"/>
+      <w:bookmarkEnd w:id="68"/>
       <w:r>
         <w:t xml:space="preserve"> Uspostava MQTT veze i obnova pretplate.</w:t>
       </w:r>
@@ -19462,7 +19512,8 @@
           <w:numId w:val="16"/>
         </w:numPr>
       </w:pPr>
-      <w:bookmarkStart w:id="44" w:name="_Toc233368206"/>
+      <w:bookmarkStart w:id="69" w:name="_Toc233368206"/>
+      <w:bookmarkStart w:id="70" w:name="_Toc233388956"/>
       <w:r>
         <w:t xml:space="preserve">Servis za unos: </w:t>
       </w:r>
@@ -19474,7 +19525,8 @@
       <w:r>
         <w:t xml:space="preserve"> i pohrana</w:t>
       </w:r>
-      <w:bookmarkEnd w:id="44"/>
+      <w:bookmarkEnd w:id="69"/>
+      <w:bookmarkEnd w:id="70"/>
     </w:p>
     <w:p>
       <w:proofErr w:type="spellStart"/>
@@ -20523,7 +20575,7 @@
       <w:pPr>
         <w:pStyle w:val="Caption"/>
       </w:pPr>
-      <w:bookmarkStart w:id="45" w:name="_Ref_Kod_4_3"/>
+      <w:bookmarkStart w:id="71" w:name="_Ref_Kod_4_3"/>
       <w:r>
         <w:t xml:space="preserve">Kôd </w:t>
       </w:r>
@@ -20546,7 +20598,7 @@
           <w:t>3</w:t>
         </w:r>
       </w:fldSimple>
-      <w:bookmarkEnd w:id="45"/>
+      <w:bookmarkEnd w:id="71"/>
       <w:r>
         <w:t xml:space="preserve"> Servis za </w:t>
       </w:r>
@@ -22458,7 +22510,7 @@
       <w:pPr>
         <w:pStyle w:val="Caption"/>
       </w:pPr>
-      <w:bookmarkStart w:id="46" w:name="_Ref_Kod_4_4"/>
+      <w:bookmarkStart w:id="72" w:name="_Ref_Kod_4_4"/>
       <w:r>
         <w:t xml:space="preserve">Kôd </w:t>
       </w:r>
@@ -22481,7 +22533,7 @@
           <w:t>4</w:t>
         </w:r>
       </w:fldSimple>
-      <w:bookmarkEnd w:id="46"/>
+      <w:bookmarkEnd w:id="72"/>
       <w:r>
         <w:t xml:space="preserve"> Obrada poruke: </w:t>
       </w:r>
@@ -22645,11 +22697,13 @@
           <w:numId w:val="16"/>
         </w:numPr>
       </w:pPr>
-      <w:bookmarkStart w:id="47" w:name="_Toc233368207"/>
+      <w:bookmarkStart w:id="73" w:name="_Toc233368207"/>
+      <w:bookmarkStart w:id="74" w:name="_Toc233388957"/>
       <w:r>
         <w:t>Servis za upozorenja: vrednovanje pravila i obavijesti</w:t>
       </w:r>
-      <w:bookmarkEnd w:id="47"/>
+      <w:bookmarkEnd w:id="73"/>
+      <w:bookmarkEnd w:id="74"/>
     </w:p>
     <w:p>
       <w:r>
@@ -23167,7 +23221,7 @@
       <w:pPr>
         <w:pStyle w:val="Caption"/>
       </w:pPr>
-      <w:bookmarkStart w:id="48" w:name="_Ref_Kod_4_5"/>
+      <w:bookmarkStart w:id="75" w:name="_Ref_Kod_4_5"/>
       <w:r>
         <w:t xml:space="preserve">Kôd </w:t>
       </w:r>
@@ -23190,7 +23244,7 @@
           <w:t>5</w:t>
         </w:r>
       </w:fldSimple>
-      <w:bookmarkEnd w:id="48"/>
+      <w:bookmarkEnd w:id="75"/>
       <w:r>
         <w:t xml:space="preserve"> Konfiguracija pravila upozorenja.</w:t>
       </w:r>
@@ -23712,7 +23766,7 @@
       <w:pPr>
         <w:pStyle w:val="Caption"/>
       </w:pPr>
-      <w:bookmarkStart w:id="49" w:name="_Ref_Kod_4_6"/>
+      <w:bookmarkStart w:id="76" w:name="_Ref_Kod_4_6"/>
       <w:r>
         <w:t xml:space="preserve">Kôd </w:t>
       </w:r>
@@ -23735,7 +23789,7 @@
           <w:t>6</w:t>
         </w:r>
       </w:fldSimple>
-      <w:bookmarkEnd w:id="49"/>
+      <w:bookmarkEnd w:id="76"/>
       <w:r>
         <w:t xml:space="preserve"> Određivanje razine ozbiljnosti upozorenja.</w:t>
       </w:r>
@@ -25495,7 +25549,7 @@
       <w:pPr>
         <w:pStyle w:val="Caption"/>
       </w:pPr>
-      <w:bookmarkStart w:id="50" w:name="_Ref_Kod_4_7"/>
+      <w:bookmarkStart w:id="77" w:name="_Ref_Kod_4_7"/>
       <w:r>
         <w:t xml:space="preserve">Kôd </w:t>
       </w:r>
@@ -25518,7 +25572,7 @@
           <w:t>7</w:t>
         </w:r>
       </w:fldSimple>
-      <w:bookmarkEnd w:id="50"/>
+      <w:bookmarkEnd w:id="77"/>
       <w:r>
         <w:t xml:space="preserve"> Pohrana događaja upozorenja i </w:t>
       </w:r>
@@ -25539,12 +25593,14 @@
           <w:numId w:val="16"/>
         </w:numPr>
       </w:pPr>
-      <w:bookmarkStart w:id="51" w:name="_Toc233368208"/>
+      <w:bookmarkStart w:id="78" w:name="_Toc233368208"/>
+      <w:bookmarkStart w:id="79" w:name="_Toc233388958"/>
       <w:r>
         <w:lastRenderedPageBreak/>
         <w:t>Shema baze podataka</w:t>
       </w:r>
-      <w:bookmarkEnd w:id="51"/>
+      <w:bookmarkEnd w:id="78"/>
+      <w:bookmarkEnd w:id="79"/>
     </w:p>
     <w:p>
       <w:r>
@@ -26336,7 +26392,7 @@
       <w:pPr>
         <w:pStyle w:val="Caption"/>
       </w:pPr>
-      <w:bookmarkStart w:id="52" w:name="_Ref_Kod_4_8"/>
+      <w:bookmarkStart w:id="80" w:name="_Ref_Kod_4_8"/>
       <w:r>
         <w:t xml:space="preserve">Kôd </w:t>
       </w:r>
@@ -26359,7 +26415,7 @@
           <w:t>8</w:t>
         </w:r>
       </w:fldSimple>
-      <w:bookmarkEnd w:id="52"/>
+      <w:bookmarkEnd w:id="80"/>
       <w:r>
         <w:t xml:space="preserve"> Migracija sheme i stvaranje </w:t>
       </w:r>
@@ -27205,7 +27261,7 @@
       <w:pPr>
         <w:pStyle w:val="Caption"/>
       </w:pPr>
-      <w:bookmarkStart w:id="53" w:name="_Ref_Kod_4_9"/>
+      <w:bookmarkStart w:id="81" w:name="_Ref_Kod_4_9"/>
       <w:r>
         <w:t xml:space="preserve">Kôd </w:t>
       </w:r>
@@ -27228,7 +27284,7 @@
           <w:t>9</w:t>
         </w:r>
       </w:fldSimple>
-      <w:bookmarkEnd w:id="53"/>
+      <w:bookmarkEnd w:id="81"/>
       <w:r>
         <w:t xml:space="preserve"> JPA entitet očitanja telemetrije.</w:t>
       </w:r>
@@ -27241,12 +27297,14 @@
           <w:numId w:val="16"/>
         </w:numPr>
       </w:pPr>
-      <w:bookmarkStart w:id="54" w:name="_Toc233368209"/>
+      <w:bookmarkStart w:id="82" w:name="_Toc233368209"/>
+      <w:bookmarkStart w:id="83" w:name="_Toc233388959"/>
       <w:r>
         <w:lastRenderedPageBreak/>
         <w:t>Infrastruktura i pokretanje</w:t>
       </w:r>
-      <w:bookmarkEnd w:id="54"/>
+      <w:bookmarkEnd w:id="82"/>
+      <w:bookmarkEnd w:id="83"/>
     </w:p>
     <w:p>
       <w:r>
@@ -27369,7 +27427,8 @@
           <w:numId w:val="16"/>
         </w:numPr>
       </w:pPr>
-      <w:bookmarkStart w:id="55" w:name="_Toc233368210"/>
+      <w:bookmarkStart w:id="84" w:name="_Toc233368210"/>
+      <w:bookmarkStart w:id="85" w:name="_Toc233388960"/>
       <w:proofErr w:type="spellStart"/>
       <w:r>
         <w:t>Docker</w:t>
@@ -27386,7 +27445,8 @@
       <w:r>
         <w:t xml:space="preserve"> konfiguracija</w:t>
       </w:r>
-      <w:bookmarkEnd w:id="55"/>
+      <w:bookmarkEnd w:id="84"/>
+      <w:bookmarkEnd w:id="85"/>
     </w:p>
     <w:p>
       <w:r>
@@ -30391,7 +30451,7 @@
       <w:pPr>
         <w:pStyle w:val="Caption"/>
       </w:pPr>
-      <w:bookmarkStart w:id="56" w:name="_Ref_Kod_5_1"/>
+      <w:bookmarkStart w:id="86" w:name="_Ref_Kod_5_1"/>
       <w:r>
         <w:t xml:space="preserve">Kôd </w:t>
       </w:r>
@@ -30414,7 +30474,7 @@
           <w:t>1</w:t>
         </w:r>
       </w:fldSimple>
-      <w:bookmarkEnd w:id="56"/>
+      <w:bookmarkEnd w:id="86"/>
       <w:r>
         <w:t xml:space="preserve"> Konfiguracija okruženja u datoteci </w:t>
       </w:r>
@@ -30946,7 +31006,7 @@
       <w:pPr>
         <w:pStyle w:val="Caption"/>
       </w:pPr>
-      <w:bookmarkStart w:id="57" w:name="_Ref_Kod_5_2"/>
+      <w:bookmarkStart w:id="87" w:name="_Ref_Kod_5_2"/>
       <w:r>
         <w:t xml:space="preserve">Kôd </w:t>
       </w:r>
@@ -30969,7 +31029,7 @@
           <w:t>2</w:t>
         </w:r>
       </w:fldSimple>
-      <w:bookmarkEnd w:id="57"/>
+      <w:bookmarkEnd w:id="87"/>
       <w:r>
         <w:t xml:space="preserve"> Višefazni </w:t>
       </w:r>
@@ -30995,7 +31055,8 @@
           <w:numId w:val="16"/>
         </w:numPr>
       </w:pPr>
-      <w:bookmarkStart w:id="58" w:name="_Toc233368211"/>
+      <w:bookmarkStart w:id="88" w:name="_Toc233368211"/>
+      <w:bookmarkStart w:id="89" w:name="_Toc233388961"/>
       <w:r>
         <w:t xml:space="preserve">Konfiguracija </w:t>
       </w:r>
@@ -31007,7 +31068,8 @@
       <w:r>
         <w:t xml:space="preserve"> posrednika</w:t>
       </w:r>
-      <w:bookmarkEnd w:id="58"/>
+      <w:bookmarkEnd w:id="88"/>
+      <w:bookmarkEnd w:id="89"/>
     </w:p>
     <w:p>
       <w:r>
@@ -31636,7 +31698,7 @@
       <w:pPr>
         <w:pStyle w:val="Caption"/>
       </w:pPr>
-      <w:bookmarkStart w:id="59" w:name="_Ref_Kod_5_3"/>
+      <w:bookmarkStart w:id="90" w:name="_Ref_Kod_5_3"/>
       <w:r>
         <w:t xml:space="preserve">Kôd </w:t>
       </w:r>
@@ -31659,7 +31721,7 @@
           <w:t>3</w:t>
         </w:r>
       </w:fldSimple>
-      <w:bookmarkEnd w:id="59"/>
+      <w:bookmarkEnd w:id="90"/>
       <w:r>
         <w:t xml:space="preserve"> Konfiguracija posrednika </w:t>
       </w:r>
@@ -31680,7 +31742,8 @@
           <w:numId w:val="16"/>
         </w:numPr>
       </w:pPr>
-      <w:bookmarkStart w:id="60" w:name="_Toc233368212"/>
+      <w:bookmarkStart w:id="91" w:name="_Toc233368212"/>
+      <w:bookmarkStart w:id="92" w:name="_Toc233388962"/>
       <w:r>
         <w:t xml:space="preserve">Konfiguracija </w:t>
       </w:r>
@@ -31692,7 +31755,8 @@
       <w:r>
         <w:t xml:space="preserve"> pohrane</w:t>
       </w:r>
-      <w:bookmarkEnd w:id="60"/>
+      <w:bookmarkEnd w:id="91"/>
+      <w:bookmarkEnd w:id="92"/>
     </w:p>
     <w:p>
       <w:r>
@@ -31827,11 +31891,13 @@
           <w:numId w:val="16"/>
         </w:numPr>
       </w:pPr>
-      <w:bookmarkStart w:id="61" w:name="_Toc233368213"/>
+      <w:bookmarkStart w:id="93" w:name="_Toc233368213"/>
+      <w:bookmarkStart w:id="94" w:name="_Toc233388963"/>
       <w:r>
         <w:t>Pokretanje i verifikacija sustava</w:t>
       </w:r>
-      <w:bookmarkEnd w:id="61"/>
+      <w:bookmarkEnd w:id="93"/>
+      <w:bookmarkEnd w:id="94"/>
     </w:p>
     <w:p>
       <w:r>
@@ -32267,12 +32333,14 @@
           <w:numId w:val="16"/>
         </w:numPr>
       </w:pPr>
-      <w:bookmarkStart w:id="62" w:name="_Toc233368214"/>
+      <w:bookmarkStart w:id="95" w:name="_Toc233368214"/>
+      <w:bookmarkStart w:id="96" w:name="_Toc233388964"/>
       <w:r>
         <w:lastRenderedPageBreak/>
         <w:t>Testiranje i rezultati</w:t>
       </w:r>
-      <w:bookmarkEnd w:id="62"/>
+      <w:bookmarkEnd w:id="95"/>
+      <w:bookmarkEnd w:id="96"/>
     </w:p>
     <w:p>
       <w:r>
@@ -32303,11 +32371,13 @@
           <w:numId w:val="16"/>
         </w:numPr>
       </w:pPr>
-      <w:bookmarkStart w:id="63" w:name="_Toc233368215"/>
+      <w:bookmarkStart w:id="97" w:name="_Toc233368215"/>
+      <w:bookmarkStart w:id="98" w:name="_Toc233388965"/>
       <w:r>
         <w:t>Metodologija testiranja</w:t>
       </w:r>
-      <w:bookmarkEnd w:id="63"/>
+      <w:bookmarkEnd w:id="97"/>
+      <w:bookmarkEnd w:id="98"/>
     </w:p>
     <w:p>
       <w:r>
@@ -33122,7 +33192,7 @@
       <w:pPr>
         <w:pStyle w:val="Caption"/>
       </w:pPr>
-      <w:bookmarkStart w:id="64" w:name="_Ref_Kod_6_1"/>
+      <w:bookmarkStart w:id="99" w:name="_Ref_Kod_6_1"/>
       <w:r>
         <w:t xml:space="preserve">Kôd </w:t>
       </w:r>
@@ -33145,7 +33215,7 @@
           <w:t>1</w:t>
         </w:r>
       </w:fldSimple>
-      <w:bookmarkEnd w:id="64"/>
+      <w:bookmarkEnd w:id="99"/>
       <w:r>
         <w:t xml:space="preserve"> SQL upit za izračun percentila latencije.</w:t>
       </w:r>
@@ -33186,12 +33256,14 @@
           <w:numId w:val="16"/>
         </w:numPr>
       </w:pPr>
-      <w:bookmarkStart w:id="65" w:name="_Toc233368216"/>
+      <w:bookmarkStart w:id="100" w:name="_Toc233368216"/>
+      <w:bookmarkStart w:id="101" w:name="_Toc233388966"/>
       <w:r>
         <w:lastRenderedPageBreak/>
         <w:t>T1: Stabilno opterećenje</w:t>
       </w:r>
-      <w:bookmarkEnd w:id="65"/>
+      <w:bookmarkEnd w:id="100"/>
+      <w:bookmarkEnd w:id="101"/>
     </w:p>
     <w:p>
       <w:r>
@@ -33234,7 +33306,7 @@
       <w:pPr>
         <w:pStyle w:val="Caption"/>
       </w:pPr>
-      <w:bookmarkStart w:id="66" w:name="_Ref_Tab_6_1"/>
+      <w:bookmarkStart w:id="102" w:name="_Ref_Tab_6_1"/>
       <w:r>
         <w:t xml:space="preserve">Tablica </w:t>
       </w:r>
@@ -33257,7 +33329,7 @@
           <w:t>1</w:t>
         </w:r>
       </w:fldSimple>
-      <w:bookmarkEnd w:id="66"/>
+      <w:bookmarkEnd w:id="102"/>
       <w:r>
         <w:t xml:space="preserve"> Rezultati scenarija T1 (stabilno opterećenje).</w:t>
       </w:r>
@@ -34260,7 +34332,8 @@
           <w:numId w:val="16"/>
         </w:numPr>
       </w:pPr>
-      <w:bookmarkStart w:id="67" w:name="_Toc233368217"/>
+      <w:bookmarkStart w:id="103" w:name="_Toc233368217"/>
+      <w:bookmarkStart w:id="104" w:name="_Toc233388967"/>
       <w:r>
         <w:t xml:space="preserve">T2: Usporedba razina </w:t>
       </w:r>
@@ -34268,7 +34341,8 @@
       <w:r>
         <w:t>QoS</w:t>
       </w:r>
-      <w:bookmarkEnd w:id="67"/>
+      <w:bookmarkEnd w:id="103"/>
+      <w:bookmarkEnd w:id="104"/>
       <w:proofErr w:type="spellEnd"/>
     </w:p>
     <w:p>
@@ -34415,7 +34489,7 @@
       <w:pPr>
         <w:pStyle w:val="Caption"/>
       </w:pPr>
-      <w:bookmarkStart w:id="68" w:name="_Ref_Tab_6_2"/>
+      <w:bookmarkStart w:id="105" w:name="_Ref_Tab_6_2"/>
       <w:r>
         <w:t xml:space="preserve">Tablica </w:t>
       </w:r>
@@ -34438,7 +34512,7 @@
           <w:t>2</w:t>
         </w:r>
       </w:fldSimple>
-      <w:bookmarkEnd w:id="68"/>
+      <w:bookmarkEnd w:id="105"/>
       <w:r>
         <w:t xml:space="preserve"> Usporedba razina </w:t>
       </w:r>
@@ -35049,7 +35123,7 @@
       <w:pPr>
         <w:pStyle w:val="Caption"/>
       </w:pPr>
-      <w:bookmarkStart w:id="69" w:name="_Ref_Sl_6_1"/>
+      <w:bookmarkStart w:id="106" w:name="_Ref_Sl_6_1"/>
       <w:r>
         <w:t xml:space="preserve">Sl. </w:t>
       </w:r>
@@ -35072,7 +35146,7 @@
           <w:t>1</w:t>
         </w:r>
       </w:fldSimple>
-      <w:bookmarkEnd w:id="69"/>
+      <w:bookmarkEnd w:id="106"/>
       <w:r>
         <w:t xml:space="preserve"> Postotak gubitka poruka uz nedostupnog potrošača: </w:t>
       </w:r>
@@ -35101,11 +35175,13 @@
           <w:numId w:val="16"/>
         </w:numPr>
       </w:pPr>
-      <w:bookmarkStart w:id="70" w:name="_Toc233368218"/>
+      <w:bookmarkStart w:id="107" w:name="_Toc233368218"/>
+      <w:bookmarkStart w:id="108" w:name="_Toc233388968"/>
       <w:r>
         <w:t>T3: Obrada duplikata</w:t>
       </w:r>
-      <w:bookmarkEnd w:id="70"/>
+      <w:bookmarkEnd w:id="107"/>
+      <w:bookmarkEnd w:id="108"/>
     </w:p>
     <w:p>
       <w:r>
@@ -35165,7 +35241,7 @@
       <w:pPr>
         <w:pStyle w:val="Caption"/>
       </w:pPr>
-      <w:bookmarkStart w:id="71" w:name="_Ref_Tab_6_3"/>
+      <w:bookmarkStart w:id="109" w:name="_Ref_Tab_6_3"/>
       <w:r>
         <w:t xml:space="preserve">Tablica </w:t>
       </w:r>
@@ -35188,7 +35264,7 @@
           <w:t>3</w:t>
         </w:r>
       </w:fldSimple>
-      <w:bookmarkEnd w:id="71"/>
+      <w:bookmarkEnd w:id="109"/>
       <w:r>
         <w:t xml:space="preserve"> Rezultati scenarija T3 (obrada duplikata).</w:t>
       </w:r>
@@ -35468,11 +35544,13 @@
           <w:numId w:val="16"/>
         </w:numPr>
       </w:pPr>
-      <w:bookmarkStart w:id="72" w:name="_Toc233368219"/>
+      <w:bookmarkStart w:id="110" w:name="_Toc233368219"/>
+      <w:bookmarkStart w:id="111" w:name="_Toc233388969"/>
       <w:r>
         <w:t>T4: Kvar posrednika</w:t>
       </w:r>
-      <w:bookmarkEnd w:id="72"/>
+      <w:bookmarkEnd w:id="110"/>
+      <w:bookmarkEnd w:id="111"/>
     </w:p>
     <w:p>
       <w:r>
@@ -35548,7 +35626,7 @@
       <w:pPr>
         <w:pStyle w:val="Caption"/>
       </w:pPr>
-      <w:bookmarkStart w:id="73" w:name="_Ref_Tab_6_4"/>
+      <w:bookmarkStart w:id="112" w:name="_Ref_Tab_6_4"/>
       <w:r>
         <w:t xml:space="preserve">Tablica </w:t>
       </w:r>
@@ -35571,7 +35649,7 @@
           <w:t>4</w:t>
         </w:r>
       </w:fldSimple>
-      <w:bookmarkEnd w:id="73"/>
+      <w:bookmarkEnd w:id="112"/>
       <w:r>
         <w:t xml:space="preserve"> Rezultati scenarija T4 (kvar posrednika, </w:t>
       </w:r>
@@ -36124,11 +36202,13 @@
           <w:numId w:val="16"/>
         </w:numPr>
       </w:pPr>
-      <w:bookmarkStart w:id="74" w:name="_Toc233368220"/>
+      <w:bookmarkStart w:id="113" w:name="_Toc233368220"/>
+      <w:bookmarkStart w:id="114" w:name="_Toc233388970"/>
       <w:r>
         <w:t>T5: Kvar servisa za unos</w:t>
       </w:r>
-      <w:bookmarkEnd w:id="74"/>
+      <w:bookmarkEnd w:id="113"/>
+      <w:bookmarkEnd w:id="114"/>
     </w:p>
     <w:p>
       <w:r>
@@ -36204,7 +36284,7 @@
       <w:pPr>
         <w:pStyle w:val="Caption"/>
       </w:pPr>
-      <w:bookmarkStart w:id="75" w:name="_Ref_Tab_6_5"/>
+      <w:bookmarkStart w:id="115" w:name="_Ref_Tab_6_5"/>
       <w:r>
         <w:t xml:space="preserve">Tablica </w:t>
       </w:r>
@@ -36227,7 +36307,7 @@
           <w:t>5</w:t>
         </w:r>
       </w:fldSimple>
-      <w:bookmarkEnd w:id="75"/>
+      <w:bookmarkEnd w:id="115"/>
       <w:r>
         <w:t xml:space="preserve"> Rezultati scenarija T5 (kvar servisa za unos).</w:t>
       </w:r>
@@ -36639,7 +36719,8 @@
           <w:numId w:val="16"/>
         </w:numPr>
       </w:pPr>
-      <w:bookmarkStart w:id="76" w:name="_Toc233368221"/>
+      <w:bookmarkStart w:id="116" w:name="_Toc233368221"/>
+      <w:bookmarkStart w:id="117" w:name="_Toc233388971"/>
       <w:r>
         <w:t xml:space="preserve">T6: </w:t>
       </w:r>
@@ -36651,7 +36732,8 @@
       <w:r>
         <w:t xml:space="preserve"> pod opterećenjem</w:t>
       </w:r>
-      <w:bookmarkEnd w:id="76"/>
+      <w:bookmarkEnd w:id="116"/>
+      <w:bookmarkEnd w:id="117"/>
     </w:p>
     <w:p>
       <w:r>
@@ -36728,7 +36810,7 @@
       <w:pPr>
         <w:pStyle w:val="Caption"/>
       </w:pPr>
-      <w:bookmarkStart w:id="77" w:name="_Ref_Tab_6_6"/>
+      <w:bookmarkStart w:id="118" w:name="_Ref_Tab_6_6"/>
       <w:r>
         <w:t xml:space="preserve">Tablica </w:t>
       </w:r>
@@ -36751,7 +36833,7 @@
           <w:t>6</w:t>
         </w:r>
       </w:fldSimple>
-      <w:bookmarkEnd w:id="77"/>
+      <w:bookmarkEnd w:id="118"/>
       <w:r>
         <w:t xml:space="preserve"> Rezultati scenarija T6 (</w:t>
       </w:r>
@@ -37355,11 +37437,13 @@
           <w:numId w:val="16"/>
         </w:numPr>
       </w:pPr>
-      <w:bookmarkStart w:id="78" w:name="_Toc233368222"/>
+      <w:bookmarkStart w:id="119" w:name="_Toc233368222"/>
+      <w:bookmarkStart w:id="120" w:name="_Toc233388972"/>
       <w:r>
         <w:t>Analiza rezultata i zaključci testiranja</w:t>
       </w:r>
-      <w:bookmarkEnd w:id="78"/>
+      <w:bookmarkEnd w:id="119"/>
+      <w:bookmarkEnd w:id="120"/>
     </w:p>
     <w:p>
       <w:r>
@@ -37585,12 +37669,14 @@
       <w:pPr>
         <w:pStyle w:val="Heading1"/>
       </w:pPr>
-      <w:bookmarkStart w:id="79" w:name="_Toc233368223"/>
+      <w:bookmarkStart w:id="121" w:name="_Toc233368223"/>
+      <w:bookmarkStart w:id="122" w:name="_Toc233388973"/>
       <w:r>
         <w:lastRenderedPageBreak/>
         <w:t>Zaključak</w:t>
       </w:r>
-      <w:bookmarkEnd w:id="79"/>
+      <w:bookmarkEnd w:id="121"/>
+      <w:bookmarkEnd w:id="122"/>
     </w:p>
     <w:p>
       <w:r>
@@ -37899,12 +37985,14 @@
       <w:pPr>
         <w:pStyle w:val="Heading1"/>
       </w:pPr>
-      <w:bookmarkStart w:id="80" w:name="_Toc233368224"/>
+      <w:bookmarkStart w:id="123" w:name="_Toc233368224"/>
+      <w:bookmarkStart w:id="124" w:name="_Toc233388974"/>
       <w:r>
         <w:lastRenderedPageBreak/>
         <w:t>Literatura</w:t>
       </w:r>
-      <w:bookmarkEnd w:id="80"/>
+      <w:bookmarkEnd w:id="123"/>
+      <w:bookmarkEnd w:id="124"/>
     </w:p>
     <w:p>
       <w:pPr>
@@ -40076,12 +40164,14 @@
       <w:pPr>
         <w:pStyle w:val="Heading1"/>
       </w:pPr>
-      <w:bookmarkStart w:id="81" w:name="_Toc233368225"/>
+      <w:bookmarkStart w:id="125" w:name="_Toc233368225"/>
+      <w:bookmarkStart w:id="126" w:name="_Toc233388975"/>
       <w:r>
         <w:lastRenderedPageBreak/>
         <w:t>Izjava o korištenju umjetne inteligencije</w:t>
       </w:r>
-      <w:bookmarkEnd w:id="81"/>
+      <w:bookmarkEnd w:id="125"/>
+      <w:bookmarkEnd w:id="126"/>
     </w:p>
     <w:p>
       <w:r>
@@ -40200,730 +40290,1709 @@
       <w:pPr>
         <w:pStyle w:val="Heading1"/>
       </w:pPr>
-      <w:bookmarkStart w:id="82" w:name="_Toc233368226"/>
+      <w:bookmarkStart w:id="127" w:name="_Toc233368226"/>
+      <w:bookmarkStart w:id="128" w:name="_Toc233388976"/>
       <w:r>
         <w:lastRenderedPageBreak/>
         <w:t>Skraćenice</w:t>
       </w:r>
-      <w:bookmarkEnd w:id="82"/>
-    </w:p>
-    <w:p>
-      <w:pPr>
-        <w:pStyle w:val="nabrajanje"/>
-      </w:pPr>
-      <w:r>
-        <w:t>DHT</w:t>
-      </w:r>
-      <w:r>
-        <w:tab/>
-      </w:r>
-      <w:r>
-        <w:rPr>
-          <w:i/>
-        </w:rPr>
-        <w:t xml:space="preserve">Digital </w:t>
-      </w:r>
-      <w:proofErr w:type="spellStart"/>
-      <w:r>
-        <w:rPr>
-          <w:i/>
-        </w:rPr>
-        <w:t>Humidity</w:t>
-      </w:r>
-      <w:proofErr w:type="spellEnd"/>
-      <w:r>
-        <w:rPr>
-          <w:i/>
-        </w:rPr>
-        <w:t xml:space="preserve"> </w:t>
-      </w:r>
-      <w:proofErr w:type="spellStart"/>
-      <w:r>
-        <w:rPr>
-          <w:i/>
-        </w:rPr>
-        <w:t>and</w:t>
-      </w:r>
-      <w:proofErr w:type="spellEnd"/>
-      <w:r>
-        <w:rPr>
-          <w:i/>
-        </w:rPr>
-        <w:t xml:space="preserve"> Temperature</w:t>
-      </w:r>
-      <w:r>
-        <w:tab/>
-        <w:t>digitalni senzor vlažnosti i temperature</w:t>
-      </w:r>
-    </w:p>
-    <w:p>
-      <w:pPr>
-        <w:pStyle w:val="nabrajanje"/>
-      </w:pPr>
-      <w:r>
-        <w:t>DTO</w:t>
-      </w:r>
-      <w:r>
-        <w:tab/>
-      </w:r>
-      <w:r>
-        <w:rPr>
-          <w:i/>
-        </w:rPr>
-        <w:t xml:space="preserve">Data Transfer </w:t>
-      </w:r>
-      <w:proofErr w:type="spellStart"/>
-      <w:r>
-        <w:rPr>
-          <w:i/>
-        </w:rPr>
-        <w:t>Object</w:t>
-      </w:r>
-      <w:proofErr w:type="spellEnd"/>
-      <w:r>
-        <w:tab/>
-        <w:t>objekt za prijenos podataka</w:t>
-      </w:r>
-    </w:p>
-    <w:p>
-      <w:pPr>
-        <w:pStyle w:val="nabrajanje"/>
-      </w:pPr>
-      <w:r>
-        <w:t>EDA</w:t>
-      </w:r>
-      <w:r>
-        <w:tab/>
-      </w:r>
-      <w:r>
-        <w:rPr>
-          <w:i/>
-        </w:rPr>
-        <w:t>Event-Driven Architecture</w:t>
-      </w:r>
-      <w:r>
-        <w:tab/>
-        <w:t>arhitektura vođena događajima</w:t>
-      </w:r>
-    </w:p>
-    <w:p>
-      <w:pPr>
-        <w:pStyle w:val="nabrajanje"/>
-      </w:pPr>
-      <w:r>
-        <w:t>GPIO</w:t>
-      </w:r>
-      <w:r>
-        <w:tab/>
-      </w:r>
-      <w:r>
-        <w:rPr>
-          <w:i/>
-        </w:rPr>
-        <w:t>General-</w:t>
-      </w:r>
-      <w:proofErr w:type="spellStart"/>
-      <w:r>
-        <w:rPr>
-          <w:i/>
-        </w:rPr>
-        <w:t>Purpose</w:t>
-      </w:r>
-      <w:proofErr w:type="spellEnd"/>
-      <w:r>
-        <w:rPr>
-          <w:i/>
-        </w:rPr>
-        <w:t xml:space="preserve"> Input/Output</w:t>
-      </w:r>
-      <w:r>
-        <w:tab/>
-        <w:t>ulazno-izlazna nožica opće namjene</w:t>
-      </w:r>
-    </w:p>
-    <w:p>
-      <w:pPr>
-        <w:pStyle w:val="nabrajanje"/>
-      </w:pPr>
-      <w:r>
-        <w:t>HTTP</w:t>
-      </w:r>
-      <w:r>
-        <w:tab/>
-      </w:r>
-      <w:proofErr w:type="spellStart"/>
-      <w:r>
-        <w:rPr>
-          <w:i/>
-        </w:rPr>
-        <w:t>HyperText</w:t>
-      </w:r>
-      <w:proofErr w:type="spellEnd"/>
-      <w:r>
-        <w:rPr>
-          <w:i/>
-        </w:rPr>
-        <w:t xml:space="preserve"> Transfer </w:t>
-      </w:r>
-      <w:proofErr w:type="spellStart"/>
-      <w:r>
-        <w:rPr>
-          <w:i/>
-        </w:rPr>
-        <w:t>Protocol</w:t>
-      </w:r>
-      <w:proofErr w:type="spellEnd"/>
-      <w:r>
-        <w:tab/>
-        <w:t>protokol za prijenos hiperteksta</w:t>
-      </w:r>
-    </w:p>
-    <w:p>
-      <w:pPr>
-        <w:pStyle w:val="nabrajanje"/>
-      </w:pPr>
-      <w:proofErr w:type="spellStart"/>
-      <w:r>
-        <w:t>IoT</w:t>
-      </w:r>
-      <w:proofErr w:type="spellEnd"/>
-      <w:r>
-        <w:tab/>
-      </w:r>
-      <w:r>
-        <w:rPr>
-          <w:i/>
-        </w:rPr>
-        <w:t xml:space="preserve">Internet of </w:t>
-      </w:r>
-      <w:proofErr w:type="spellStart"/>
-      <w:r>
-        <w:rPr>
-          <w:i/>
-        </w:rPr>
-        <w:t>Things</w:t>
-      </w:r>
-      <w:proofErr w:type="spellEnd"/>
-      <w:r>
-        <w:tab/>
-        <w:t>Internet stvari</w:t>
-      </w:r>
-    </w:p>
-    <w:p>
-      <w:pPr>
-        <w:pStyle w:val="nabrajanje"/>
-      </w:pPr>
-      <w:r>
-        <w:t>JAR</w:t>
-      </w:r>
-      <w:r>
-        <w:tab/>
-      </w:r>
-      <w:r>
-        <w:rPr>
-          <w:i/>
-        </w:rPr>
-        <w:t xml:space="preserve">Java </w:t>
-      </w:r>
-      <w:proofErr w:type="spellStart"/>
-      <w:r>
-        <w:rPr>
-          <w:i/>
-        </w:rPr>
-        <w:t>Archive</w:t>
-      </w:r>
-      <w:proofErr w:type="spellEnd"/>
-      <w:r>
-        <w:tab/>
-        <w:t>Java arhiva</w:t>
-      </w:r>
-    </w:p>
-    <w:p>
-      <w:pPr>
-        <w:pStyle w:val="nabrajanje"/>
-      </w:pPr>
-      <w:r>
-        <w:t>JPA</w:t>
-      </w:r>
-      <w:r>
-        <w:tab/>
-      </w:r>
-      <w:r>
-        <w:rPr>
-          <w:i/>
-        </w:rPr>
-        <w:t xml:space="preserve">Java </w:t>
-      </w:r>
-      <w:proofErr w:type="spellStart"/>
-      <w:r>
-        <w:rPr>
-          <w:i/>
-        </w:rPr>
-        <w:t>Persistence</w:t>
-      </w:r>
-      <w:proofErr w:type="spellEnd"/>
-      <w:r>
-        <w:rPr>
-          <w:i/>
-        </w:rPr>
-        <w:t xml:space="preserve"> API</w:t>
-      </w:r>
-      <w:r>
-        <w:tab/>
-        <w:t xml:space="preserve">Java sučelje za </w:t>
-      </w:r>
-      <w:proofErr w:type="spellStart"/>
-      <w:r>
-        <w:t>perzistenciju</w:t>
-      </w:r>
-      <w:proofErr w:type="spellEnd"/>
-    </w:p>
-    <w:p>
-      <w:pPr>
-        <w:pStyle w:val="nabrajanje"/>
-      </w:pPr>
-      <w:r>
-        <w:t>JRE</w:t>
-      </w:r>
-      <w:r>
-        <w:tab/>
-      </w:r>
-      <w:r>
-        <w:rPr>
-          <w:i/>
-        </w:rPr>
-        <w:t xml:space="preserve">Java </w:t>
-      </w:r>
-      <w:proofErr w:type="spellStart"/>
-      <w:r>
-        <w:rPr>
-          <w:i/>
-        </w:rPr>
-        <w:t>Runtime</w:t>
-      </w:r>
-      <w:proofErr w:type="spellEnd"/>
-      <w:r>
-        <w:rPr>
-          <w:i/>
-        </w:rPr>
-        <w:t xml:space="preserve"> </w:t>
-      </w:r>
-      <w:proofErr w:type="spellStart"/>
-      <w:r>
-        <w:rPr>
-          <w:i/>
-        </w:rPr>
-        <w:t>Environment</w:t>
-      </w:r>
-      <w:proofErr w:type="spellEnd"/>
-      <w:r>
-        <w:tab/>
-        <w:t>izvršno okruženje Jave</w:t>
-      </w:r>
-    </w:p>
-    <w:p>
-      <w:pPr>
-        <w:pStyle w:val="nabrajanje"/>
-      </w:pPr>
-      <w:r>
-        <w:t>JSON</w:t>
-      </w:r>
-      <w:r>
-        <w:tab/>
-      </w:r>
-      <w:r>
-        <w:rPr>
-          <w:i/>
-        </w:rPr>
-        <w:t xml:space="preserve">JavaScript </w:t>
-      </w:r>
-      <w:proofErr w:type="spellStart"/>
-      <w:r>
-        <w:rPr>
-          <w:i/>
-        </w:rPr>
-        <w:t>Object</w:t>
-      </w:r>
-      <w:proofErr w:type="spellEnd"/>
-      <w:r>
-        <w:rPr>
-          <w:i/>
-        </w:rPr>
-        <w:t xml:space="preserve"> </w:t>
-      </w:r>
-      <w:proofErr w:type="spellStart"/>
-      <w:r>
-        <w:rPr>
-          <w:i/>
-        </w:rPr>
-        <w:t>Notation</w:t>
-      </w:r>
-      <w:proofErr w:type="spellEnd"/>
-      <w:r>
-        <w:tab/>
-        <w:t>JavaScript zapis objekata</w:t>
-      </w:r>
-    </w:p>
-    <w:p>
-      <w:pPr>
-        <w:pStyle w:val="nabrajanje"/>
-      </w:pPr>
-      <w:r>
-        <w:t>LRU</w:t>
-      </w:r>
-      <w:r>
-        <w:tab/>
-      </w:r>
-      <w:r>
-        <w:rPr>
-          <w:i/>
-        </w:rPr>
-        <w:t xml:space="preserve">Least </w:t>
-      </w:r>
-      <w:proofErr w:type="spellStart"/>
-      <w:r>
-        <w:rPr>
-          <w:i/>
-        </w:rPr>
-        <w:t>Recently</w:t>
-      </w:r>
-      <w:proofErr w:type="spellEnd"/>
-      <w:r>
-        <w:rPr>
-          <w:i/>
-        </w:rPr>
-        <w:t xml:space="preserve"> </w:t>
-      </w:r>
-      <w:proofErr w:type="spellStart"/>
-      <w:r>
-        <w:rPr>
-          <w:i/>
-        </w:rPr>
-        <w:t>Used</w:t>
-      </w:r>
-      <w:proofErr w:type="spellEnd"/>
-      <w:r>
-        <w:tab/>
-        <w:t>najdulje nekorišteni</w:t>
-      </w:r>
-    </w:p>
-    <w:p>
-      <w:pPr>
-        <w:pStyle w:val="nabrajanje"/>
-      </w:pPr>
-      <w:r>
-        <w:t>MQTT</w:t>
-      </w:r>
-      <w:r>
-        <w:tab/>
-      </w:r>
-      <w:r>
-        <w:rPr>
-          <w:i/>
-        </w:rPr>
-        <w:t xml:space="preserve">Message </w:t>
-      </w:r>
-      <w:proofErr w:type="spellStart"/>
-      <w:r>
-        <w:rPr>
-          <w:i/>
-        </w:rPr>
-        <w:t>Queuing</w:t>
-      </w:r>
-      <w:proofErr w:type="spellEnd"/>
-      <w:r>
-        <w:rPr>
-          <w:i/>
-        </w:rPr>
-        <w:t xml:space="preserve"> </w:t>
-      </w:r>
-      <w:proofErr w:type="spellStart"/>
-      <w:r>
-        <w:rPr>
-          <w:i/>
-        </w:rPr>
-        <w:t>Telemetry</w:t>
-      </w:r>
-      <w:proofErr w:type="spellEnd"/>
-      <w:r>
-        <w:rPr>
-          <w:i/>
-        </w:rPr>
-        <w:t xml:space="preserve"> Transport</w:t>
-      </w:r>
-      <w:r>
-        <w:tab/>
-        <w:t>protokol za prijenos telemetrije</w:t>
-      </w:r>
-    </w:p>
-    <w:p>
-      <w:pPr>
-        <w:pStyle w:val="nabrajanje"/>
-      </w:pPr>
-      <w:r>
-        <w:t>NTP</w:t>
-      </w:r>
-      <w:r>
-        <w:tab/>
-      </w:r>
-      <w:r>
-        <w:rPr>
-          <w:i/>
-        </w:rPr>
-        <w:t xml:space="preserve">Network Time </w:t>
-      </w:r>
-      <w:proofErr w:type="spellStart"/>
-      <w:r>
-        <w:rPr>
-          <w:i/>
-        </w:rPr>
-        <w:t>Protocol</w:t>
-      </w:r>
-      <w:proofErr w:type="spellEnd"/>
-      <w:r>
-        <w:tab/>
-        <w:t>mrežni protokol za sinkronizaciju vremena</w:t>
-      </w:r>
-    </w:p>
-    <w:p>
-      <w:pPr>
-        <w:pStyle w:val="nabrajanje"/>
-      </w:pPr>
-      <w:proofErr w:type="spellStart"/>
-      <w:r>
-        <w:t>QoS</w:t>
-      </w:r>
-      <w:proofErr w:type="spellEnd"/>
-      <w:r>
-        <w:tab/>
-      </w:r>
-      <w:proofErr w:type="spellStart"/>
-      <w:r>
-        <w:rPr>
-          <w:i/>
-        </w:rPr>
-        <w:t>Quality</w:t>
-      </w:r>
-      <w:proofErr w:type="spellEnd"/>
-      <w:r>
-        <w:rPr>
-          <w:i/>
-        </w:rPr>
-        <w:t xml:space="preserve"> of Service</w:t>
-      </w:r>
-      <w:r>
-        <w:tab/>
-        <w:t>kvaliteta usluge</w:t>
-      </w:r>
-    </w:p>
-    <w:p>
-      <w:pPr>
-        <w:pStyle w:val="nabrajanje"/>
-      </w:pPr>
-      <w:r>
-        <w:t>SQL</w:t>
-      </w:r>
-      <w:r>
-        <w:tab/>
-      </w:r>
-      <w:proofErr w:type="spellStart"/>
-      <w:r>
-        <w:rPr>
-          <w:i/>
-        </w:rPr>
-        <w:t>Structured</w:t>
-      </w:r>
-      <w:proofErr w:type="spellEnd"/>
-      <w:r>
-        <w:rPr>
-          <w:i/>
-        </w:rPr>
-        <w:t xml:space="preserve"> Query Language</w:t>
-      </w:r>
-      <w:r>
-        <w:tab/>
-        <w:t>strukturirani upitni jezik</w:t>
-      </w:r>
-    </w:p>
-    <w:p>
-      <w:pPr>
-        <w:pStyle w:val="nabrajanje"/>
-      </w:pPr>
-      <w:r>
-        <w:t>TCP</w:t>
-      </w:r>
-      <w:r>
-        <w:tab/>
-      </w:r>
-      <w:proofErr w:type="spellStart"/>
-      <w:r>
-        <w:rPr>
-          <w:i/>
-        </w:rPr>
-        <w:t>Transmission</w:t>
-      </w:r>
-      <w:proofErr w:type="spellEnd"/>
-      <w:r>
-        <w:rPr>
-          <w:i/>
-        </w:rPr>
-        <w:t xml:space="preserve"> </w:t>
-      </w:r>
-      <w:proofErr w:type="spellStart"/>
-      <w:r>
-        <w:rPr>
-          <w:i/>
-        </w:rPr>
-        <w:t>Control</w:t>
-      </w:r>
-      <w:proofErr w:type="spellEnd"/>
-      <w:r>
-        <w:rPr>
-          <w:i/>
-        </w:rPr>
-        <w:t xml:space="preserve"> </w:t>
-      </w:r>
-      <w:proofErr w:type="spellStart"/>
-      <w:r>
-        <w:rPr>
-          <w:i/>
-        </w:rPr>
-        <w:t>Protocol</w:t>
-      </w:r>
-      <w:proofErr w:type="spellEnd"/>
-      <w:r>
-        <w:tab/>
-        <w:t>protokol za upravljanje prijenosom</w:t>
-      </w:r>
-    </w:p>
-    <w:p>
-      <w:pPr>
-        <w:pStyle w:val="nabrajanje"/>
-      </w:pPr>
-      <w:r>
-        <w:t>TLS</w:t>
-      </w:r>
-      <w:r>
-        <w:tab/>
-      </w:r>
-      <w:r>
-        <w:rPr>
-          <w:i/>
-        </w:rPr>
-        <w:t xml:space="preserve">Transport </w:t>
-      </w:r>
-      <w:proofErr w:type="spellStart"/>
-      <w:r>
-        <w:rPr>
-          <w:i/>
-        </w:rPr>
-        <w:t>Layer</w:t>
-      </w:r>
-      <w:proofErr w:type="spellEnd"/>
-      <w:r>
-        <w:rPr>
-          <w:i/>
-        </w:rPr>
-        <w:t xml:space="preserve"> Security</w:t>
-      </w:r>
-      <w:r>
-        <w:tab/>
-        <w:t>sigurnost transportnog sloja</w:t>
-      </w:r>
-    </w:p>
-    <w:p>
-      <w:pPr>
-        <w:pStyle w:val="nabrajanje"/>
-      </w:pPr>
-      <w:r>
-        <w:t>TOCTOU</w:t>
-      </w:r>
-      <w:r>
-        <w:tab/>
-      </w:r>
-      <w:r>
-        <w:rPr>
-          <w:i/>
-        </w:rPr>
-        <w:t>Time-Of-</w:t>
-      </w:r>
-      <w:proofErr w:type="spellStart"/>
-      <w:r>
-        <w:rPr>
-          <w:i/>
-        </w:rPr>
-        <w:t>Check</w:t>
-      </w:r>
-      <w:proofErr w:type="spellEnd"/>
-      <w:r>
-        <w:rPr>
-          <w:i/>
-        </w:rPr>
-        <w:t xml:space="preserve"> To Time-Of-Use</w:t>
-      </w:r>
-      <w:r>
-        <w:tab/>
-        <w:t>vrijeme provjere naspram vremena uporabe</w:t>
-      </w:r>
-    </w:p>
-    <w:p>
-      <w:pPr>
-        <w:pStyle w:val="nabrajanje"/>
-      </w:pPr>
-      <w:r>
-        <w:t>TTL</w:t>
-      </w:r>
-      <w:r>
-        <w:tab/>
-      </w:r>
-      <w:r>
-        <w:rPr>
-          <w:i/>
-        </w:rPr>
-        <w:t>Time-To-Live</w:t>
-      </w:r>
-      <w:r>
-        <w:tab/>
-        <w:t>vrijeme do isteka</w:t>
-      </w:r>
-    </w:p>
-    <w:p>
-      <w:pPr>
-        <w:pStyle w:val="nabrajanje"/>
-      </w:pPr>
-      <w:r>
-        <w:t>UUID</w:t>
-      </w:r>
-      <w:r>
-        <w:tab/>
-      </w:r>
-      <w:proofErr w:type="spellStart"/>
-      <w:r>
-        <w:rPr>
-          <w:i/>
-        </w:rPr>
-        <w:t>Universally</w:t>
-      </w:r>
-      <w:proofErr w:type="spellEnd"/>
-      <w:r>
-        <w:rPr>
-          <w:i/>
-        </w:rPr>
-        <w:t xml:space="preserve"> Unique </w:t>
-      </w:r>
-      <w:proofErr w:type="spellStart"/>
-      <w:r>
-        <w:rPr>
-          <w:i/>
-        </w:rPr>
-        <w:t>Identifier</w:t>
-      </w:r>
-      <w:proofErr w:type="spellEnd"/>
-      <w:r>
-        <w:tab/>
-        <w:t>univerzalno jedinstveni identifikator</w:t>
-      </w:r>
-    </w:p>
+      <w:bookmarkEnd w:id="127"/>
+      <w:bookmarkEnd w:id="128"/>
+    </w:p>
+    <w:tbl>
+      <w:tblPr>
+        <w:tblW w:w="0" w:type="auto"/>
+        <w:tblCellMar>
+          <w:top w:w="57" w:type="dxa"/>
+          <w:bottom w:w="28" w:type="dxa"/>
+        </w:tblCellMar>
+        <w:tblLook w:val="04A0" w:firstRow="1" w:lastRow="0" w:firstColumn="1" w:lastColumn="0" w:noHBand="0" w:noVBand="1"/>
+      </w:tblPr>
+      <w:tblGrid>
+        <w:gridCol w:w="1181"/>
+        <w:gridCol w:w="4064"/>
+        <w:gridCol w:w="3543"/>
+      </w:tblGrid>
+      <w:tr>
+        <w:tc>
+          <w:tcPr>
+            <w:tcW w:w="0" w:type="auto"/>
+          </w:tcPr>
+          <w:p>
+            <w:pPr>
+              <w:pStyle w:val="nabrajanje"/>
+              <w:spacing w:before="0" w:after="0"/>
+              <w:jc w:val="left"/>
+              <w:rPr>
+                <w:szCs w:val="32"/>
+              </w:rPr>
+            </w:pPr>
+            <w:r>
+              <w:rPr>
+                <w:szCs w:val="32"/>
+              </w:rPr>
+              <w:t>DHT</w:t>
+            </w:r>
+          </w:p>
+        </w:tc>
+        <w:tc>
+          <w:tcPr>
+            <w:tcW w:w="4064" w:type="dxa"/>
+          </w:tcPr>
+          <w:p>
+            <w:pPr>
+              <w:pStyle w:val="nabrajanje"/>
+              <w:spacing w:before="0" w:after="0"/>
+              <w:jc w:val="left"/>
+              <w:rPr>
+                <w:i/>
+                <w:szCs w:val="32"/>
+              </w:rPr>
+            </w:pPr>
+            <w:r>
+              <w:rPr>
+                <w:i/>
+                <w:szCs w:val="32"/>
+              </w:rPr>
+              <w:t xml:space="preserve">Digital </w:t>
+            </w:r>
+            <w:proofErr w:type="spellStart"/>
+            <w:r>
+              <w:rPr>
+                <w:i/>
+                <w:szCs w:val="32"/>
+              </w:rPr>
+              <w:t>Humidity</w:t>
+            </w:r>
+            <w:proofErr w:type="spellEnd"/>
+            <w:r>
+              <w:rPr>
+                <w:i/>
+                <w:szCs w:val="32"/>
+              </w:rPr>
+              <w:t xml:space="preserve"> </w:t>
+            </w:r>
+            <w:proofErr w:type="spellStart"/>
+            <w:r>
+              <w:rPr>
+                <w:i/>
+                <w:szCs w:val="32"/>
+              </w:rPr>
+              <w:t>and</w:t>
+            </w:r>
+            <w:proofErr w:type="spellEnd"/>
+            <w:r>
+              <w:rPr>
+                <w:i/>
+                <w:szCs w:val="32"/>
+              </w:rPr>
+              <w:t xml:space="preserve"> Temperature</w:t>
+            </w:r>
+          </w:p>
+        </w:tc>
+        <w:tc>
+          <w:tcPr>
+            <w:tcW w:w="3543" w:type="dxa"/>
+          </w:tcPr>
+          <w:p>
+            <w:pPr>
+              <w:pStyle w:val="nabrajanje"/>
+              <w:spacing w:before="0" w:after="0"/>
+              <w:jc w:val="left"/>
+              <w:rPr>
+                <w:szCs w:val="32"/>
+              </w:rPr>
+            </w:pPr>
+            <w:r>
+              <w:rPr>
+                <w:szCs w:val="32"/>
+              </w:rPr>
+              <w:t>digitalni senzor vlažnosti i temperature</w:t>
+            </w:r>
+          </w:p>
+        </w:tc>
+      </w:tr>
+      <w:tr>
+        <w:tc>
+          <w:tcPr>
+            <w:tcW w:w="0" w:type="auto"/>
+          </w:tcPr>
+          <w:p>
+            <w:pPr>
+              <w:pStyle w:val="nabrajanje"/>
+              <w:spacing w:before="0" w:after="0"/>
+              <w:jc w:val="left"/>
+              <w:rPr>
+                <w:szCs w:val="32"/>
+              </w:rPr>
+            </w:pPr>
+            <w:r>
+              <w:rPr>
+                <w:szCs w:val="32"/>
+              </w:rPr>
+              <w:t>DTO</w:t>
+            </w:r>
+          </w:p>
+        </w:tc>
+        <w:tc>
+          <w:tcPr>
+            <w:tcW w:w="4064" w:type="dxa"/>
+          </w:tcPr>
+          <w:p>
+            <w:pPr>
+              <w:pStyle w:val="nabrajanje"/>
+              <w:spacing w:before="0" w:after="0"/>
+              <w:jc w:val="left"/>
+              <w:rPr>
+                <w:i/>
+                <w:szCs w:val="32"/>
+              </w:rPr>
+            </w:pPr>
+            <w:r>
+              <w:rPr>
+                <w:i/>
+                <w:szCs w:val="32"/>
+              </w:rPr>
+              <w:t xml:space="preserve">Data Transfer </w:t>
+            </w:r>
+            <w:proofErr w:type="spellStart"/>
+            <w:r>
+              <w:rPr>
+                <w:i/>
+                <w:szCs w:val="32"/>
+              </w:rPr>
+              <w:t>Object</w:t>
+            </w:r>
+            <w:proofErr w:type="spellEnd"/>
+          </w:p>
+        </w:tc>
+        <w:tc>
+          <w:tcPr>
+            <w:tcW w:w="3543" w:type="dxa"/>
+          </w:tcPr>
+          <w:p>
+            <w:pPr>
+              <w:pStyle w:val="nabrajanje"/>
+              <w:spacing w:before="0" w:after="0"/>
+              <w:jc w:val="left"/>
+              <w:rPr>
+                <w:szCs w:val="32"/>
+              </w:rPr>
+            </w:pPr>
+            <w:r>
+              <w:rPr>
+                <w:szCs w:val="32"/>
+              </w:rPr>
+              <w:t>objekt za prijenos podataka</w:t>
+            </w:r>
+          </w:p>
+        </w:tc>
+      </w:tr>
+      <w:tr>
+        <w:tc>
+          <w:tcPr>
+            <w:tcW w:w="0" w:type="auto"/>
+          </w:tcPr>
+          <w:p>
+            <w:pPr>
+              <w:pStyle w:val="nabrajanje"/>
+              <w:spacing w:before="0" w:after="0"/>
+              <w:jc w:val="left"/>
+              <w:rPr>
+                <w:szCs w:val="32"/>
+              </w:rPr>
+            </w:pPr>
+            <w:r>
+              <w:rPr>
+                <w:szCs w:val="32"/>
+              </w:rPr>
+              <w:t>EDA</w:t>
+            </w:r>
+          </w:p>
+        </w:tc>
+        <w:tc>
+          <w:tcPr>
+            <w:tcW w:w="4064" w:type="dxa"/>
+          </w:tcPr>
+          <w:p>
+            <w:pPr>
+              <w:pStyle w:val="nabrajanje"/>
+              <w:spacing w:before="0" w:after="0"/>
+              <w:jc w:val="left"/>
+              <w:rPr>
+                <w:i/>
+                <w:szCs w:val="32"/>
+              </w:rPr>
+            </w:pPr>
+            <w:r>
+              <w:rPr>
+                <w:i/>
+                <w:szCs w:val="32"/>
+              </w:rPr>
+              <w:t>Event-Driven Architecture</w:t>
+            </w:r>
+          </w:p>
+        </w:tc>
+        <w:tc>
+          <w:tcPr>
+            <w:tcW w:w="3543" w:type="dxa"/>
+          </w:tcPr>
+          <w:p>
+            <w:pPr>
+              <w:pStyle w:val="nabrajanje"/>
+              <w:spacing w:before="0" w:after="0"/>
+              <w:jc w:val="left"/>
+              <w:rPr>
+                <w:szCs w:val="32"/>
+              </w:rPr>
+            </w:pPr>
+            <w:r>
+              <w:rPr>
+                <w:szCs w:val="32"/>
+              </w:rPr>
+              <w:t>arhitektura vođena događajima</w:t>
+            </w:r>
+          </w:p>
+        </w:tc>
+      </w:tr>
+      <w:tr>
+        <w:tc>
+          <w:tcPr>
+            <w:tcW w:w="0" w:type="auto"/>
+          </w:tcPr>
+          <w:p>
+            <w:pPr>
+              <w:pStyle w:val="nabrajanje"/>
+              <w:spacing w:before="0" w:after="0"/>
+              <w:jc w:val="left"/>
+              <w:rPr>
+                <w:szCs w:val="32"/>
+              </w:rPr>
+            </w:pPr>
+            <w:r>
+              <w:rPr>
+                <w:szCs w:val="32"/>
+              </w:rPr>
+              <w:t>GPIO</w:t>
+            </w:r>
+          </w:p>
+        </w:tc>
+        <w:tc>
+          <w:tcPr>
+            <w:tcW w:w="4064" w:type="dxa"/>
+          </w:tcPr>
+          <w:p>
+            <w:pPr>
+              <w:pStyle w:val="nabrajanje"/>
+              <w:spacing w:before="0" w:after="0"/>
+              <w:jc w:val="left"/>
+              <w:rPr>
+                <w:i/>
+                <w:szCs w:val="32"/>
+              </w:rPr>
+            </w:pPr>
+            <w:r>
+              <w:rPr>
+                <w:i/>
+                <w:szCs w:val="32"/>
+              </w:rPr>
+              <w:t>General-</w:t>
+            </w:r>
+            <w:proofErr w:type="spellStart"/>
+            <w:r>
+              <w:rPr>
+                <w:i/>
+                <w:szCs w:val="32"/>
+              </w:rPr>
+              <w:t>Purpose</w:t>
+            </w:r>
+            <w:proofErr w:type="spellEnd"/>
+            <w:r>
+              <w:rPr>
+                <w:i/>
+                <w:szCs w:val="32"/>
+              </w:rPr>
+              <w:t xml:space="preserve"> Input/Output</w:t>
+            </w:r>
+          </w:p>
+        </w:tc>
+        <w:tc>
+          <w:tcPr>
+            <w:tcW w:w="3543" w:type="dxa"/>
+          </w:tcPr>
+          <w:p>
+            <w:pPr>
+              <w:pStyle w:val="nabrajanje"/>
+              <w:spacing w:before="0" w:after="0"/>
+              <w:jc w:val="left"/>
+              <w:rPr>
+                <w:szCs w:val="32"/>
+              </w:rPr>
+            </w:pPr>
+            <w:r>
+              <w:rPr>
+                <w:szCs w:val="32"/>
+              </w:rPr>
+              <w:t>ulazno-izlazna nožica opće namjene</w:t>
+            </w:r>
+          </w:p>
+        </w:tc>
+      </w:tr>
+      <w:tr>
+        <w:tc>
+          <w:tcPr>
+            <w:tcW w:w="0" w:type="auto"/>
+          </w:tcPr>
+          <w:p>
+            <w:pPr>
+              <w:pStyle w:val="nabrajanje"/>
+              <w:spacing w:before="0" w:after="0"/>
+              <w:jc w:val="left"/>
+              <w:rPr>
+                <w:szCs w:val="32"/>
+              </w:rPr>
+            </w:pPr>
+            <w:r>
+              <w:rPr>
+                <w:szCs w:val="32"/>
+              </w:rPr>
+              <w:t>HTTP</w:t>
+            </w:r>
+          </w:p>
+        </w:tc>
+        <w:tc>
+          <w:tcPr>
+            <w:tcW w:w="4064" w:type="dxa"/>
+          </w:tcPr>
+          <w:p>
+            <w:pPr>
+              <w:pStyle w:val="nabrajanje"/>
+              <w:spacing w:before="0" w:after="0"/>
+              <w:jc w:val="left"/>
+              <w:rPr>
+                <w:i/>
+                <w:szCs w:val="32"/>
+              </w:rPr>
+            </w:pPr>
+            <w:proofErr w:type="spellStart"/>
+            <w:r>
+              <w:rPr>
+                <w:i/>
+                <w:szCs w:val="32"/>
+              </w:rPr>
+              <w:t>HyperText</w:t>
+            </w:r>
+            <w:proofErr w:type="spellEnd"/>
+            <w:r>
+              <w:rPr>
+                <w:i/>
+                <w:szCs w:val="32"/>
+              </w:rPr>
+              <w:t xml:space="preserve"> Transfer </w:t>
+            </w:r>
+            <w:proofErr w:type="spellStart"/>
+            <w:r>
+              <w:rPr>
+                <w:i/>
+                <w:szCs w:val="32"/>
+              </w:rPr>
+              <w:t>Protocol</w:t>
+            </w:r>
+            <w:proofErr w:type="spellEnd"/>
+          </w:p>
+        </w:tc>
+        <w:tc>
+          <w:tcPr>
+            <w:tcW w:w="3543" w:type="dxa"/>
+          </w:tcPr>
+          <w:p>
+            <w:pPr>
+              <w:pStyle w:val="nabrajanje"/>
+              <w:spacing w:before="0" w:after="0"/>
+              <w:jc w:val="left"/>
+              <w:rPr>
+                <w:szCs w:val="32"/>
+              </w:rPr>
+            </w:pPr>
+            <w:r>
+              <w:rPr>
+                <w:szCs w:val="32"/>
+              </w:rPr>
+              <w:t>protokol za prijenos hiperteksta</w:t>
+            </w:r>
+          </w:p>
+        </w:tc>
+      </w:tr>
+      <w:tr>
+        <w:tc>
+          <w:tcPr>
+            <w:tcW w:w="0" w:type="auto"/>
+          </w:tcPr>
+          <w:p>
+            <w:pPr>
+              <w:pStyle w:val="nabrajanje"/>
+              <w:spacing w:before="0" w:after="0"/>
+              <w:jc w:val="left"/>
+              <w:rPr>
+                <w:szCs w:val="32"/>
+              </w:rPr>
+            </w:pPr>
+            <w:proofErr w:type="spellStart"/>
+            <w:r>
+              <w:rPr>
+                <w:szCs w:val="32"/>
+              </w:rPr>
+              <w:t>IoT</w:t>
+            </w:r>
+            <w:proofErr w:type="spellEnd"/>
+          </w:p>
+        </w:tc>
+        <w:tc>
+          <w:tcPr>
+            <w:tcW w:w="4064" w:type="dxa"/>
+          </w:tcPr>
+          <w:p>
+            <w:pPr>
+              <w:pStyle w:val="nabrajanje"/>
+              <w:spacing w:before="0" w:after="0"/>
+              <w:jc w:val="left"/>
+              <w:rPr>
+                <w:i/>
+                <w:szCs w:val="32"/>
+              </w:rPr>
+            </w:pPr>
+            <w:r>
+              <w:rPr>
+                <w:i/>
+                <w:szCs w:val="32"/>
+              </w:rPr>
+              <w:t xml:space="preserve">Internet of </w:t>
+            </w:r>
+            <w:proofErr w:type="spellStart"/>
+            <w:r>
+              <w:rPr>
+                <w:i/>
+                <w:szCs w:val="32"/>
+              </w:rPr>
+              <w:t>Things</w:t>
+            </w:r>
+            <w:proofErr w:type="spellEnd"/>
+          </w:p>
+        </w:tc>
+        <w:tc>
+          <w:tcPr>
+            <w:tcW w:w="3543" w:type="dxa"/>
+          </w:tcPr>
+          <w:p>
+            <w:pPr>
+              <w:pStyle w:val="nabrajanje"/>
+              <w:spacing w:before="0" w:after="0"/>
+              <w:jc w:val="left"/>
+              <w:rPr>
+                <w:szCs w:val="32"/>
+              </w:rPr>
+            </w:pPr>
+            <w:r>
+              <w:rPr>
+                <w:szCs w:val="32"/>
+              </w:rPr>
+              <w:t>Internet stvari</w:t>
+            </w:r>
+          </w:p>
+        </w:tc>
+      </w:tr>
+      <w:tr>
+        <w:tc>
+          <w:tcPr>
+            <w:tcW w:w="0" w:type="auto"/>
+          </w:tcPr>
+          <w:p>
+            <w:pPr>
+              <w:pStyle w:val="nabrajanje"/>
+              <w:spacing w:before="0" w:after="0"/>
+              <w:jc w:val="left"/>
+              <w:rPr>
+                <w:szCs w:val="32"/>
+              </w:rPr>
+            </w:pPr>
+            <w:r>
+              <w:rPr>
+                <w:szCs w:val="32"/>
+              </w:rPr>
+              <w:t>JAR</w:t>
+            </w:r>
+          </w:p>
+        </w:tc>
+        <w:tc>
+          <w:tcPr>
+            <w:tcW w:w="4064" w:type="dxa"/>
+          </w:tcPr>
+          <w:p>
+            <w:pPr>
+              <w:pStyle w:val="nabrajanje"/>
+              <w:spacing w:before="0" w:after="0"/>
+              <w:jc w:val="left"/>
+              <w:rPr>
+                <w:i/>
+                <w:szCs w:val="32"/>
+              </w:rPr>
+            </w:pPr>
+            <w:r>
+              <w:rPr>
+                <w:i/>
+                <w:szCs w:val="32"/>
+              </w:rPr>
+              <w:t xml:space="preserve">Java </w:t>
+            </w:r>
+            <w:proofErr w:type="spellStart"/>
+            <w:r>
+              <w:rPr>
+                <w:i/>
+                <w:szCs w:val="32"/>
+              </w:rPr>
+              <w:t>Archive</w:t>
+            </w:r>
+            <w:proofErr w:type="spellEnd"/>
+          </w:p>
+        </w:tc>
+        <w:tc>
+          <w:tcPr>
+            <w:tcW w:w="3543" w:type="dxa"/>
+          </w:tcPr>
+          <w:p>
+            <w:pPr>
+              <w:pStyle w:val="nabrajanje"/>
+              <w:spacing w:before="0" w:after="0"/>
+              <w:jc w:val="left"/>
+              <w:rPr>
+                <w:szCs w:val="32"/>
+              </w:rPr>
+            </w:pPr>
+            <w:r>
+              <w:rPr>
+                <w:szCs w:val="32"/>
+              </w:rPr>
+              <w:t>Java arhiva</w:t>
+            </w:r>
+          </w:p>
+        </w:tc>
+      </w:tr>
+      <w:tr>
+        <w:tc>
+          <w:tcPr>
+            <w:tcW w:w="0" w:type="auto"/>
+          </w:tcPr>
+          <w:p>
+            <w:pPr>
+              <w:pStyle w:val="nabrajanje"/>
+              <w:spacing w:before="0" w:after="0"/>
+              <w:jc w:val="left"/>
+              <w:rPr>
+                <w:szCs w:val="32"/>
+              </w:rPr>
+            </w:pPr>
+            <w:r>
+              <w:rPr>
+                <w:szCs w:val="32"/>
+              </w:rPr>
+              <w:t>JPA</w:t>
+            </w:r>
+          </w:p>
+        </w:tc>
+        <w:tc>
+          <w:tcPr>
+            <w:tcW w:w="4064" w:type="dxa"/>
+          </w:tcPr>
+          <w:p>
+            <w:pPr>
+              <w:pStyle w:val="nabrajanje"/>
+              <w:spacing w:before="0" w:after="0"/>
+              <w:jc w:val="left"/>
+              <w:rPr>
+                <w:i/>
+                <w:szCs w:val="32"/>
+              </w:rPr>
+            </w:pPr>
+            <w:r>
+              <w:rPr>
+                <w:i/>
+                <w:szCs w:val="32"/>
+              </w:rPr>
+              <w:t xml:space="preserve">Java </w:t>
+            </w:r>
+            <w:proofErr w:type="spellStart"/>
+            <w:r>
+              <w:rPr>
+                <w:i/>
+                <w:szCs w:val="32"/>
+              </w:rPr>
+              <w:t>Persistence</w:t>
+            </w:r>
+            <w:proofErr w:type="spellEnd"/>
+            <w:r>
+              <w:rPr>
+                <w:i/>
+                <w:szCs w:val="32"/>
+              </w:rPr>
+              <w:t xml:space="preserve"> API</w:t>
+            </w:r>
+          </w:p>
+        </w:tc>
+        <w:tc>
+          <w:tcPr>
+            <w:tcW w:w="3543" w:type="dxa"/>
+          </w:tcPr>
+          <w:p>
+            <w:pPr>
+              <w:pStyle w:val="nabrajanje"/>
+              <w:spacing w:before="0" w:after="0"/>
+              <w:jc w:val="left"/>
+              <w:rPr>
+                <w:szCs w:val="32"/>
+              </w:rPr>
+            </w:pPr>
+            <w:r>
+              <w:rPr>
+                <w:szCs w:val="32"/>
+              </w:rPr>
+              <w:t xml:space="preserve">Java sučelje za </w:t>
+            </w:r>
+            <w:proofErr w:type="spellStart"/>
+            <w:r>
+              <w:rPr>
+                <w:szCs w:val="32"/>
+              </w:rPr>
+              <w:t>perzistenciju</w:t>
+            </w:r>
+            <w:proofErr w:type="spellEnd"/>
+          </w:p>
+        </w:tc>
+      </w:tr>
+      <w:tr>
+        <w:tc>
+          <w:tcPr>
+            <w:tcW w:w="0" w:type="auto"/>
+          </w:tcPr>
+          <w:p>
+            <w:pPr>
+              <w:pStyle w:val="nabrajanje"/>
+              <w:spacing w:before="0" w:after="0"/>
+              <w:jc w:val="left"/>
+              <w:rPr>
+                <w:szCs w:val="32"/>
+              </w:rPr>
+            </w:pPr>
+            <w:r>
+              <w:rPr>
+                <w:szCs w:val="32"/>
+              </w:rPr>
+              <w:t>JRE</w:t>
+            </w:r>
+          </w:p>
+        </w:tc>
+        <w:tc>
+          <w:tcPr>
+            <w:tcW w:w="4064" w:type="dxa"/>
+          </w:tcPr>
+          <w:p>
+            <w:pPr>
+              <w:pStyle w:val="nabrajanje"/>
+              <w:spacing w:before="0" w:after="0"/>
+              <w:jc w:val="left"/>
+              <w:rPr>
+                <w:i/>
+                <w:szCs w:val="32"/>
+              </w:rPr>
+            </w:pPr>
+            <w:r>
+              <w:rPr>
+                <w:i/>
+                <w:szCs w:val="32"/>
+              </w:rPr>
+              <w:t xml:space="preserve">Java </w:t>
+            </w:r>
+            <w:proofErr w:type="spellStart"/>
+            <w:r>
+              <w:rPr>
+                <w:i/>
+                <w:szCs w:val="32"/>
+              </w:rPr>
+              <w:t>Runtime</w:t>
+            </w:r>
+            <w:proofErr w:type="spellEnd"/>
+            <w:r>
+              <w:rPr>
+                <w:i/>
+                <w:szCs w:val="32"/>
+              </w:rPr>
+              <w:t xml:space="preserve"> </w:t>
+            </w:r>
+            <w:proofErr w:type="spellStart"/>
+            <w:r>
+              <w:rPr>
+                <w:i/>
+                <w:szCs w:val="32"/>
+              </w:rPr>
+              <w:t>Environment</w:t>
+            </w:r>
+            <w:proofErr w:type="spellEnd"/>
+          </w:p>
+        </w:tc>
+        <w:tc>
+          <w:tcPr>
+            <w:tcW w:w="3543" w:type="dxa"/>
+          </w:tcPr>
+          <w:p>
+            <w:pPr>
+              <w:pStyle w:val="nabrajanje"/>
+              <w:spacing w:before="0" w:after="0"/>
+              <w:jc w:val="left"/>
+              <w:rPr>
+                <w:szCs w:val="32"/>
+              </w:rPr>
+            </w:pPr>
+            <w:r>
+              <w:rPr>
+                <w:szCs w:val="32"/>
+              </w:rPr>
+              <w:t>izvršno okruženje Jave</w:t>
+            </w:r>
+          </w:p>
+        </w:tc>
+      </w:tr>
+      <w:tr>
+        <w:tc>
+          <w:tcPr>
+            <w:tcW w:w="0" w:type="auto"/>
+          </w:tcPr>
+          <w:p>
+            <w:pPr>
+              <w:pStyle w:val="nabrajanje"/>
+              <w:spacing w:before="0" w:after="0"/>
+              <w:jc w:val="left"/>
+              <w:rPr>
+                <w:szCs w:val="32"/>
+              </w:rPr>
+            </w:pPr>
+            <w:r>
+              <w:rPr>
+                <w:szCs w:val="32"/>
+              </w:rPr>
+              <w:t>JSON</w:t>
+            </w:r>
+          </w:p>
+        </w:tc>
+        <w:tc>
+          <w:tcPr>
+            <w:tcW w:w="4064" w:type="dxa"/>
+          </w:tcPr>
+          <w:p>
+            <w:pPr>
+              <w:pStyle w:val="nabrajanje"/>
+              <w:spacing w:before="0" w:after="0"/>
+              <w:jc w:val="left"/>
+              <w:rPr>
+                <w:i/>
+                <w:szCs w:val="32"/>
+              </w:rPr>
+            </w:pPr>
+            <w:r>
+              <w:rPr>
+                <w:i/>
+                <w:szCs w:val="32"/>
+              </w:rPr>
+              <w:t xml:space="preserve">JavaScript </w:t>
+            </w:r>
+            <w:proofErr w:type="spellStart"/>
+            <w:r>
+              <w:rPr>
+                <w:i/>
+                <w:szCs w:val="32"/>
+              </w:rPr>
+              <w:t>Object</w:t>
+            </w:r>
+            <w:proofErr w:type="spellEnd"/>
+            <w:r>
+              <w:rPr>
+                <w:i/>
+                <w:szCs w:val="32"/>
+              </w:rPr>
+              <w:t xml:space="preserve"> </w:t>
+            </w:r>
+            <w:proofErr w:type="spellStart"/>
+            <w:r>
+              <w:rPr>
+                <w:i/>
+                <w:szCs w:val="32"/>
+              </w:rPr>
+              <w:t>Notation</w:t>
+            </w:r>
+            <w:proofErr w:type="spellEnd"/>
+          </w:p>
+        </w:tc>
+        <w:tc>
+          <w:tcPr>
+            <w:tcW w:w="3543" w:type="dxa"/>
+          </w:tcPr>
+          <w:p>
+            <w:pPr>
+              <w:pStyle w:val="nabrajanje"/>
+              <w:spacing w:before="0" w:after="0"/>
+              <w:jc w:val="left"/>
+              <w:rPr>
+                <w:szCs w:val="32"/>
+              </w:rPr>
+            </w:pPr>
+            <w:r>
+              <w:rPr>
+                <w:szCs w:val="32"/>
+              </w:rPr>
+              <w:t>JavaScript zapis objekata</w:t>
+            </w:r>
+          </w:p>
+        </w:tc>
+      </w:tr>
+      <w:tr>
+        <w:tc>
+          <w:tcPr>
+            <w:tcW w:w="0" w:type="auto"/>
+          </w:tcPr>
+          <w:p>
+            <w:pPr>
+              <w:pStyle w:val="nabrajanje"/>
+              <w:spacing w:before="0" w:after="0"/>
+              <w:jc w:val="left"/>
+              <w:rPr>
+                <w:szCs w:val="32"/>
+              </w:rPr>
+            </w:pPr>
+            <w:r>
+              <w:rPr>
+                <w:szCs w:val="32"/>
+              </w:rPr>
+              <w:t>LRU</w:t>
+            </w:r>
+          </w:p>
+        </w:tc>
+        <w:tc>
+          <w:tcPr>
+            <w:tcW w:w="4064" w:type="dxa"/>
+          </w:tcPr>
+          <w:p>
+            <w:pPr>
+              <w:pStyle w:val="nabrajanje"/>
+              <w:spacing w:before="0" w:after="0"/>
+              <w:jc w:val="left"/>
+              <w:rPr>
+                <w:i/>
+                <w:szCs w:val="32"/>
+              </w:rPr>
+            </w:pPr>
+            <w:r>
+              <w:rPr>
+                <w:i/>
+                <w:szCs w:val="32"/>
+              </w:rPr>
+              <w:t xml:space="preserve">Least </w:t>
+            </w:r>
+            <w:proofErr w:type="spellStart"/>
+            <w:r>
+              <w:rPr>
+                <w:i/>
+                <w:szCs w:val="32"/>
+              </w:rPr>
+              <w:t>Recently</w:t>
+            </w:r>
+            <w:proofErr w:type="spellEnd"/>
+            <w:r>
+              <w:rPr>
+                <w:i/>
+                <w:szCs w:val="32"/>
+              </w:rPr>
+              <w:t xml:space="preserve"> </w:t>
+            </w:r>
+            <w:proofErr w:type="spellStart"/>
+            <w:r>
+              <w:rPr>
+                <w:i/>
+                <w:szCs w:val="32"/>
+              </w:rPr>
+              <w:t>Used</w:t>
+            </w:r>
+            <w:proofErr w:type="spellEnd"/>
+          </w:p>
+        </w:tc>
+        <w:tc>
+          <w:tcPr>
+            <w:tcW w:w="3543" w:type="dxa"/>
+          </w:tcPr>
+          <w:p>
+            <w:pPr>
+              <w:pStyle w:val="nabrajanje"/>
+              <w:spacing w:before="0" w:after="0"/>
+              <w:jc w:val="left"/>
+              <w:rPr>
+                <w:szCs w:val="32"/>
+              </w:rPr>
+            </w:pPr>
+            <w:r>
+              <w:rPr>
+                <w:szCs w:val="32"/>
+              </w:rPr>
+              <w:t>najdulje nekorišteni</w:t>
+            </w:r>
+          </w:p>
+        </w:tc>
+      </w:tr>
+      <w:tr>
+        <w:tc>
+          <w:tcPr>
+            <w:tcW w:w="0" w:type="auto"/>
+          </w:tcPr>
+          <w:p>
+            <w:pPr>
+              <w:pStyle w:val="nabrajanje"/>
+              <w:spacing w:before="0" w:after="0"/>
+              <w:jc w:val="left"/>
+              <w:rPr>
+                <w:szCs w:val="32"/>
+              </w:rPr>
+            </w:pPr>
+            <w:r>
+              <w:rPr>
+                <w:szCs w:val="32"/>
+              </w:rPr>
+              <w:t>MQTT</w:t>
+            </w:r>
+          </w:p>
+        </w:tc>
+        <w:tc>
+          <w:tcPr>
+            <w:tcW w:w="4064" w:type="dxa"/>
+          </w:tcPr>
+          <w:p>
+            <w:pPr>
+              <w:pStyle w:val="nabrajanje"/>
+              <w:spacing w:before="0" w:after="0"/>
+              <w:jc w:val="left"/>
+              <w:rPr>
+                <w:i/>
+                <w:szCs w:val="32"/>
+              </w:rPr>
+            </w:pPr>
+            <w:r>
+              <w:rPr>
+                <w:i/>
+                <w:szCs w:val="32"/>
+              </w:rPr>
+              <w:t xml:space="preserve">Message </w:t>
+            </w:r>
+            <w:proofErr w:type="spellStart"/>
+            <w:r>
+              <w:rPr>
+                <w:i/>
+                <w:szCs w:val="32"/>
+              </w:rPr>
+              <w:t>Queuing</w:t>
+            </w:r>
+            <w:proofErr w:type="spellEnd"/>
+            <w:r>
+              <w:rPr>
+                <w:i/>
+                <w:szCs w:val="32"/>
+              </w:rPr>
+              <w:t xml:space="preserve"> </w:t>
+            </w:r>
+            <w:proofErr w:type="spellStart"/>
+            <w:r>
+              <w:rPr>
+                <w:i/>
+                <w:szCs w:val="32"/>
+              </w:rPr>
+              <w:t>Telemetry</w:t>
+            </w:r>
+            <w:proofErr w:type="spellEnd"/>
+            <w:r>
+              <w:rPr>
+                <w:i/>
+                <w:szCs w:val="32"/>
+              </w:rPr>
+              <w:t xml:space="preserve"> Transport</w:t>
+            </w:r>
+          </w:p>
+        </w:tc>
+        <w:tc>
+          <w:tcPr>
+            <w:tcW w:w="3543" w:type="dxa"/>
+          </w:tcPr>
+          <w:p>
+            <w:pPr>
+              <w:pStyle w:val="nabrajanje"/>
+              <w:spacing w:before="0" w:after="0"/>
+              <w:jc w:val="left"/>
+              <w:rPr>
+                <w:szCs w:val="32"/>
+              </w:rPr>
+            </w:pPr>
+            <w:r>
+              <w:rPr>
+                <w:szCs w:val="32"/>
+              </w:rPr>
+              <w:t>protokol za prijenos telemetrije</w:t>
+            </w:r>
+          </w:p>
+        </w:tc>
+      </w:tr>
+      <w:tr>
+        <w:tc>
+          <w:tcPr>
+            <w:tcW w:w="0" w:type="auto"/>
+          </w:tcPr>
+          <w:p>
+            <w:pPr>
+              <w:pStyle w:val="nabrajanje"/>
+              <w:spacing w:before="0" w:after="0"/>
+              <w:jc w:val="left"/>
+              <w:rPr>
+                <w:szCs w:val="32"/>
+              </w:rPr>
+            </w:pPr>
+            <w:r>
+              <w:rPr>
+                <w:szCs w:val="32"/>
+              </w:rPr>
+              <w:t>NTP</w:t>
+            </w:r>
+          </w:p>
+        </w:tc>
+        <w:tc>
+          <w:tcPr>
+            <w:tcW w:w="4064" w:type="dxa"/>
+          </w:tcPr>
+          <w:p>
+            <w:pPr>
+              <w:pStyle w:val="nabrajanje"/>
+              <w:spacing w:before="0" w:after="0"/>
+              <w:jc w:val="left"/>
+              <w:rPr>
+                <w:i/>
+                <w:szCs w:val="32"/>
+              </w:rPr>
+            </w:pPr>
+            <w:r>
+              <w:rPr>
+                <w:i/>
+                <w:szCs w:val="32"/>
+              </w:rPr>
+              <w:t xml:space="preserve">Network Time </w:t>
+            </w:r>
+            <w:proofErr w:type="spellStart"/>
+            <w:r>
+              <w:rPr>
+                <w:i/>
+                <w:szCs w:val="32"/>
+              </w:rPr>
+              <w:t>Protocol</w:t>
+            </w:r>
+            <w:proofErr w:type="spellEnd"/>
+          </w:p>
+        </w:tc>
+        <w:tc>
+          <w:tcPr>
+            <w:tcW w:w="3543" w:type="dxa"/>
+          </w:tcPr>
+          <w:p>
+            <w:pPr>
+              <w:pStyle w:val="nabrajanje"/>
+              <w:spacing w:before="0" w:after="0"/>
+              <w:jc w:val="left"/>
+              <w:rPr>
+                <w:szCs w:val="32"/>
+              </w:rPr>
+            </w:pPr>
+            <w:r>
+              <w:rPr>
+                <w:szCs w:val="32"/>
+              </w:rPr>
+              <w:t>mrežni protokol za sinkronizaciju vremena</w:t>
+            </w:r>
+          </w:p>
+        </w:tc>
+      </w:tr>
+      <w:tr>
+        <w:tc>
+          <w:tcPr>
+            <w:tcW w:w="0" w:type="auto"/>
+          </w:tcPr>
+          <w:p>
+            <w:pPr>
+              <w:pStyle w:val="nabrajanje"/>
+              <w:spacing w:before="0" w:after="0"/>
+              <w:jc w:val="left"/>
+              <w:rPr>
+                <w:szCs w:val="32"/>
+              </w:rPr>
+            </w:pPr>
+            <w:proofErr w:type="spellStart"/>
+            <w:r>
+              <w:rPr>
+                <w:szCs w:val="32"/>
+              </w:rPr>
+              <w:t>QoS</w:t>
+            </w:r>
+            <w:proofErr w:type="spellEnd"/>
+          </w:p>
+        </w:tc>
+        <w:tc>
+          <w:tcPr>
+            <w:tcW w:w="4064" w:type="dxa"/>
+          </w:tcPr>
+          <w:p>
+            <w:pPr>
+              <w:pStyle w:val="nabrajanje"/>
+              <w:spacing w:before="0" w:after="0"/>
+              <w:jc w:val="left"/>
+              <w:rPr>
+                <w:i/>
+                <w:szCs w:val="32"/>
+              </w:rPr>
+            </w:pPr>
+            <w:proofErr w:type="spellStart"/>
+            <w:r>
+              <w:rPr>
+                <w:i/>
+                <w:szCs w:val="32"/>
+              </w:rPr>
+              <w:t>Quality</w:t>
+            </w:r>
+            <w:proofErr w:type="spellEnd"/>
+            <w:r>
+              <w:rPr>
+                <w:i/>
+                <w:szCs w:val="32"/>
+              </w:rPr>
+              <w:t xml:space="preserve"> of Service</w:t>
+            </w:r>
+          </w:p>
+        </w:tc>
+        <w:tc>
+          <w:tcPr>
+            <w:tcW w:w="3543" w:type="dxa"/>
+          </w:tcPr>
+          <w:p>
+            <w:pPr>
+              <w:pStyle w:val="nabrajanje"/>
+              <w:spacing w:before="0" w:after="0"/>
+              <w:jc w:val="left"/>
+              <w:rPr>
+                <w:szCs w:val="32"/>
+              </w:rPr>
+            </w:pPr>
+            <w:r>
+              <w:rPr>
+                <w:szCs w:val="32"/>
+              </w:rPr>
+              <w:t>kvaliteta usluge</w:t>
+            </w:r>
+          </w:p>
+        </w:tc>
+      </w:tr>
+      <w:tr>
+        <w:tc>
+          <w:tcPr>
+            <w:tcW w:w="0" w:type="auto"/>
+          </w:tcPr>
+          <w:p>
+            <w:pPr>
+              <w:pStyle w:val="nabrajanje"/>
+              <w:spacing w:before="0" w:after="0"/>
+              <w:jc w:val="left"/>
+              <w:rPr>
+                <w:szCs w:val="32"/>
+              </w:rPr>
+            </w:pPr>
+            <w:r>
+              <w:rPr>
+                <w:szCs w:val="32"/>
+              </w:rPr>
+              <w:t>SQL</w:t>
+            </w:r>
+          </w:p>
+        </w:tc>
+        <w:tc>
+          <w:tcPr>
+            <w:tcW w:w="4064" w:type="dxa"/>
+          </w:tcPr>
+          <w:p>
+            <w:pPr>
+              <w:pStyle w:val="nabrajanje"/>
+              <w:spacing w:before="0" w:after="0"/>
+              <w:jc w:val="left"/>
+              <w:rPr>
+                <w:i/>
+                <w:szCs w:val="32"/>
+              </w:rPr>
+            </w:pPr>
+            <w:proofErr w:type="spellStart"/>
+            <w:r>
+              <w:rPr>
+                <w:i/>
+                <w:szCs w:val="32"/>
+              </w:rPr>
+              <w:t>Structured</w:t>
+            </w:r>
+            <w:proofErr w:type="spellEnd"/>
+            <w:r>
+              <w:rPr>
+                <w:i/>
+                <w:szCs w:val="32"/>
+              </w:rPr>
+              <w:t xml:space="preserve"> Query Language</w:t>
+            </w:r>
+          </w:p>
+        </w:tc>
+        <w:tc>
+          <w:tcPr>
+            <w:tcW w:w="3543" w:type="dxa"/>
+          </w:tcPr>
+          <w:p>
+            <w:pPr>
+              <w:pStyle w:val="nabrajanje"/>
+              <w:spacing w:before="0" w:after="0"/>
+              <w:jc w:val="left"/>
+              <w:rPr>
+                <w:szCs w:val="32"/>
+              </w:rPr>
+            </w:pPr>
+            <w:r>
+              <w:rPr>
+                <w:szCs w:val="32"/>
+              </w:rPr>
+              <w:t>strukturirani upitni jezik</w:t>
+            </w:r>
+          </w:p>
+        </w:tc>
+      </w:tr>
+      <w:tr>
+        <w:tc>
+          <w:tcPr>
+            <w:tcW w:w="0" w:type="auto"/>
+          </w:tcPr>
+          <w:p>
+            <w:pPr>
+              <w:pStyle w:val="nabrajanje"/>
+              <w:spacing w:before="0" w:after="0"/>
+              <w:jc w:val="left"/>
+              <w:rPr>
+                <w:szCs w:val="32"/>
+              </w:rPr>
+            </w:pPr>
+            <w:r>
+              <w:rPr>
+                <w:szCs w:val="32"/>
+              </w:rPr>
+              <w:t>TCP</w:t>
+            </w:r>
+          </w:p>
+        </w:tc>
+        <w:tc>
+          <w:tcPr>
+            <w:tcW w:w="4064" w:type="dxa"/>
+          </w:tcPr>
+          <w:p>
+            <w:pPr>
+              <w:pStyle w:val="nabrajanje"/>
+              <w:spacing w:before="0" w:after="0"/>
+              <w:jc w:val="left"/>
+              <w:rPr>
+                <w:i/>
+                <w:szCs w:val="32"/>
+              </w:rPr>
+            </w:pPr>
+            <w:proofErr w:type="spellStart"/>
+            <w:r>
+              <w:rPr>
+                <w:i/>
+                <w:szCs w:val="32"/>
+              </w:rPr>
+              <w:t>Transmission</w:t>
+            </w:r>
+            <w:proofErr w:type="spellEnd"/>
+            <w:r>
+              <w:rPr>
+                <w:i/>
+                <w:szCs w:val="32"/>
+              </w:rPr>
+              <w:t xml:space="preserve"> </w:t>
+            </w:r>
+            <w:proofErr w:type="spellStart"/>
+            <w:r>
+              <w:rPr>
+                <w:i/>
+                <w:szCs w:val="32"/>
+              </w:rPr>
+              <w:t>Control</w:t>
+            </w:r>
+            <w:proofErr w:type="spellEnd"/>
+            <w:r>
+              <w:rPr>
+                <w:i/>
+                <w:szCs w:val="32"/>
+              </w:rPr>
+              <w:t xml:space="preserve"> </w:t>
+            </w:r>
+            <w:proofErr w:type="spellStart"/>
+            <w:r>
+              <w:rPr>
+                <w:i/>
+                <w:szCs w:val="32"/>
+              </w:rPr>
+              <w:t>Protocol</w:t>
+            </w:r>
+            <w:proofErr w:type="spellEnd"/>
+          </w:p>
+        </w:tc>
+        <w:tc>
+          <w:tcPr>
+            <w:tcW w:w="3543" w:type="dxa"/>
+          </w:tcPr>
+          <w:p>
+            <w:pPr>
+              <w:pStyle w:val="nabrajanje"/>
+              <w:spacing w:before="0" w:after="0"/>
+              <w:jc w:val="left"/>
+              <w:rPr>
+                <w:szCs w:val="32"/>
+              </w:rPr>
+            </w:pPr>
+            <w:r>
+              <w:rPr>
+                <w:szCs w:val="32"/>
+              </w:rPr>
+              <w:t>protokol za upravljanje prijenosom</w:t>
+            </w:r>
+          </w:p>
+        </w:tc>
+      </w:tr>
+      <w:tr>
+        <w:tc>
+          <w:tcPr>
+            <w:tcW w:w="0" w:type="auto"/>
+          </w:tcPr>
+          <w:p>
+            <w:pPr>
+              <w:pStyle w:val="nabrajanje"/>
+              <w:spacing w:before="0" w:after="0"/>
+              <w:jc w:val="left"/>
+              <w:rPr>
+                <w:szCs w:val="32"/>
+              </w:rPr>
+            </w:pPr>
+            <w:r>
+              <w:rPr>
+                <w:szCs w:val="32"/>
+              </w:rPr>
+              <w:t>TLS</w:t>
+            </w:r>
+          </w:p>
+        </w:tc>
+        <w:tc>
+          <w:tcPr>
+            <w:tcW w:w="4064" w:type="dxa"/>
+          </w:tcPr>
+          <w:p>
+            <w:pPr>
+              <w:pStyle w:val="nabrajanje"/>
+              <w:spacing w:before="0" w:after="0"/>
+              <w:jc w:val="left"/>
+              <w:rPr>
+                <w:i/>
+                <w:szCs w:val="32"/>
+              </w:rPr>
+            </w:pPr>
+            <w:r>
+              <w:rPr>
+                <w:i/>
+                <w:szCs w:val="32"/>
+              </w:rPr>
+              <w:t xml:space="preserve">Transport </w:t>
+            </w:r>
+            <w:proofErr w:type="spellStart"/>
+            <w:r>
+              <w:rPr>
+                <w:i/>
+                <w:szCs w:val="32"/>
+              </w:rPr>
+              <w:t>Layer</w:t>
+            </w:r>
+            <w:proofErr w:type="spellEnd"/>
+            <w:r>
+              <w:rPr>
+                <w:i/>
+                <w:szCs w:val="32"/>
+              </w:rPr>
+              <w:t xml:space="preserve"> Security</w:t>
+            </w:r>
+          </w:p>
+        </w:tc>
+        <w:tc>
+          <w:tcPr>
+            <w:tcW w:w="3543" w:type="dxa"/>
+          </w:tcPr>
+          <w:p>
+            <w:pPr>
+              <w:pStyle w:val="nabrajanje"/>
+              <w:spacing w:before="0" w:after="0"/>
+              <w:jc w:val="left"/>
+              <w:rPr>
+                <w:szCs w:val="32"/>
+              </w:rPr>
+            </w:pPr>
+            <w:r>
+              <w:rPr>
+                <w:szCs w:val="32"/>
+              </w:rPr>
+              <w:t>sigurnost transportnog sloja</w:t>
+            </w:r>
+          </w:p>
+        </w:tc>
+      </w:tr>
+      <w:tr>
+        <w:tc>
+          <w:tcPr>
+            <w:tcW w:w="0" w:type="auto"/>
+          </w:tcPr>
+          <w:p>
+            <w:pPr>
+              <w:pStyle w:val="nabrajanje"/>
+              <w:spacing w:before="0" w:after="0"/>
+              <w:jc w:val="left"/>
+              <w:rPr>
+                <w:szCs w:val="32"/>
+              </w:rPr>
+            </w:pPr>
+            <w:r>
+              <w:rPr>
+                <w:szCs w:val="32"/>
+              </w:rPr>
+              <w:t>TOCTOU</w:t>
+            </w:r>
+          </w:p>
+        </w:tc>
+        <w:tc>
+          <w:tcPr>
+            <w:tcW w:w="4064" w:type="dxa"/>
+          </w:tcPr>
+          <w:p>
+            <w:pPr>
+              <w:pStyle w:val="nabrajanje"/>
+              <w:spacing w:before="0" w:after="0"/>
+              <w:jc w:val="left"/>
+              <w:rPr>
+                <w:i/>
+                <w:szCs w:val="32"/>
+              </w:rPr>
+            </w:pPr>
+            <w:r>
+              <w:rPr>
+                <w:i/>
+                <w:szCs w:val="32"/>
+              </w:rPr>
+              <w:t>Time-Of-</w:t>
+            </w:r>
+            <w:proofErr w:type="spellStart"/>
+            <w:r>
+              <w:rPr>
+                <w:i/>
+                <w:szCs w:val="32"/>
+              </w:rPr>
+              <w:t>Check</w:t>
+            </w:r>
+            <w:proofErr w:type="spellEnd"/>
+            <w:r>
+              <w:rPr>
+                <w:i/>
+                <w:szCs w:val="32"/>
+              </w:rPr>
+              <w:t xml:space="preserve"> To Time-Of-Use</w:t>
+            </w:r>
+          </w:p>
+        </w:tc>
+        <w:tc>
+          <w:tcPr>
+            <w:tcW w:w="3543" w:type="dxa"/>
+          </w:tcPr>
+          <w:p>
+            <w:pPr>
+              <w:pStyle w:val="nabrajanje"/>
+              <w:spacing w:before="0" w:after="0"/>
+              <w:jc w:val="left"/>
+              <w:rPr>
+                <w:szCs w:val="32"/>
+              </w:rPr>
+            </w:pPr>
+            <w:r>
+              <w:rPr>
+                <w:szCs w:val="32"/>
+              </w:rPr>
+              <w:t>vrijeme provjere naspram vremena uporabe</w:t>
+            </w:r>
+          </w:p>
+        </w:tc>
+      </w:tr>
+      <w:tr>
+        <w:tc>
+          <w:tcPr>
+            <w:tcW w:w="0" w:type="auto"/>
+          </w:tcPr>
+          <w:p>
+            <w:pPr>
+              <w:pStyle w:val="nabrajanje"/>
+              <w:spacing w:before="0" w:after="0"/>
+              <w:jc w:val="left"/>
+              <w:rPr>
+                <w:szCs w:val="32"/>
+              </w:rPr>
+            </w:pPr>
+            <w:r>
+              <w:rPr>
+                <w:szCs w:val="32"/>
+              </w:rPr>
+              <w:t>TTL</w:t>
+            </w:r>
+          </w:p>
+        </w:tc>
+        <w:tc>
+          <w:tcPr>
+            <w:tcW w:w="4064" w:type="dxa"/>
+          </w:tcPr>
+          <w:p>
+            <w:pPr>
+              <w:pStyle w:val="nabrajanje"/>
+              <w:spacing w:before="0" w:after="0"/>
+              <w:jc w:val="left"/>
+              <w:rPr>
+                <w:i/>
+                <w:szCs w:val="32"/>
+              </w:rPr>
+            </w:pPr>
+            <w:r>
+              <w:rPr>
+                <w:i/>
+                <w:szCs w:val="32"/>
+              </w:rPr>
+              <w:t>Time-To-Live</w:t>
+            </w:r>
+          </w:p>
+        </w:tc>
+        <w:tc>
+          <w:tcPr>
+            <w:tcW w:w="3543" w:type="dxa"/>
+          </w:tcPr>
+          <w:p>
+            <w:pPr>
+              <w:pStyle w:val="nabrajanje"/>
+              <w:spacing w:before="0" w:after="0"/>
+              <w:jc w:val="left"/>
+              <w:rPr>
+                <w:szCs w:val="32"/>
+              </w:rPr>
+            </w:pPr>
+            <w:r>
+              <w:rPr>
+                <w:szCs w:val="32"/>
+              </w:rPr>
+              <w:t>vrijeme do isteka</w:t>
+            </w:r>
+          </w:p>
+        </w:tc>
+      </w:tr>
+      <w:tr>
+        <w:tc>
+          <w:tcPr>
+            <w:tcW w:w="0" w:type="auto"/>
+          </w:tcPr>
+          <w:p>
+            <w:pPr>
+              <w:pStyle w:val="nabrajanje"/>
+              <w:spacing w:before="0" w:after="0"/>
+              <w:jc w:val="left"/>
+              <w:rPr>
+                <w:szCs w:val="32"/>
+              </w:rPr>
+            </w:pPr>
+            <w:r>
+              <w:rPr>
+                <w:szCs w:val="32"/>
+              </w:rPr>
+              <w:t>UUID</w:t>
+            </w:r>
+          </w:p>
+        </w:tc>
+        <w:tc>
+          <w:tcPr>
+            <w:tcW w:w="4064" w:type="dxa"/>
+          </w:tcPr>
+          <w:p>
+            <w:pPr>
+              <w:pStyle w:val="nabrajanje"/>
+              <w:spacing w:before="0" w:after="0"/>
+              <w:jc w:val="left"/>
+              <w:rPr>
+                <w:i/>
+                <w:szCs w:val="32"/>
+              </w:rPr>
+            </w:pPr>
+            <w:proofErr w:type="spellStart"/>
+            <w:r>
+              <w:rPr>
+                <w:i/>
+                <w:szCs w:val="32"/>
+              </w:rPr>
+              <w:t>Universally</w:t>
+            </w:r>
+            <w:proofErr w:type="spellEnd"/>
+            <w:r>
+              <w:rPr>
+                <w:i/>
+                <w:szCs w:val="32"/>
+              </w:rPr>
+              <w:t xml:space="preserve"> Unique </w:t>
+            </w:r>
+            <w:proofErr w:type="spellStart"/>
+            <w:r>
+              <w:rPr>
+                <w:i/>
+                <w:szCs w:val="32"/>
+              </w:rPr>
+              <w:t>Identifier</w:t>
+            </w:r>
+            <w:proofErr w:type="spellEnd"/>
+          </w:p>
+        </w:tc>
+        <w:tc>
+          <w:tcPr>
+            <w:tcW w:w="3543" w:type="dxa"/>
+          </w:tcPr>
+          <w:p>
+            <w:pPr>
+              <w:pStyle w:val="nabrajanje"/>
+              <w:spacing w:before="0" w:after="0"/>
+              <w:jc w:val="left"/>
+              <w:rPr>
+                <w:szCs w:val="32"/>
+              </w:rPr>
+            </w:pPr>
+            <w:r>
+              <w:rPr>
+                <w:szCs w:val="32"/>
+              </w:rPr>
+              <w:t>univerzalno jedinstveni identifikator</w:t>
+            </w:r>
+          </w:p>
+        </w:tc>
+      </w:tr>
+    </w:tbl>
     <w:p/>
     <w:sectPr>
       <w:footerReference w:type="default" r:id="rId42"/>
@@ -42428,7 +43497,6 @@
   <w:style w:type="table" w:default="1" w:styleId="TableNormal">
     <w:name w:val="Normal Table"/>
     <w:uiPriority w:val="99"/>
-    <w:semiHidden/>
     <w:unhideWhenUsed/>
     <w:tblPr>
       <w:tblInd w:w="0" w:type="dxa"/>
@@ -67118,7 +68186,7 @@
 
 <file path=word/webextensions/taskpanes.xml><?xml version="1.0" encoding="utf-8"?>
 <wetp:taskpanes xmlns:wetp="http://schemas.microsoft.com/office/webextensions/taskpanes/2010/11">
-  <wetp:taskpane dockstate="right" visibility="0" width="776" row="0">
+  <wetp:taskpane dockstate="right" visibility="0" width="888" row="0">
     <wetp:webextensionref xmlns:r="http://schemas.openxmlformats.org/officeDocument/2006/relationships" r:id="rId1"/>
   </wetp:taskpane>
 </wetp:taskpanes>

</xml_diff>